<commit_message>
Ajustes de formato en documento y costos
</commit_message>
<xml_diff>
--- a/documentacion/Documento_Arquitectura_Medical_Health.docx
+++ b/documentacion/Documento_Arquitectura_Medical_Health.docx
@@ -7048,7 +7048,7 @@
               <w:rPr>
                 <w:sz w:val="19"/>
               </w:rPr>
-              <w:t>4.60</w:t>
+              <w:t>4,60</w:t>
             </w:r>
           </w:p>
         </w:tc>
@@ -7066,7 +7066,7 @@
               <w:rPr>
                 <w:sz w:val="19"/>
               </w:rPr>
-              <w:t>4.30</w:t>
+              <w:t>4,30</w:t>
             </w:r>
           </w:p>
         </w:tc>
@@ -7078,7 +7078,7 @@
         <w:rPr>
           <w:i w:val="0"/>
         </w:rPr>
-        <w:t>Resultado: Azure obtiene 4.60 puntos frente a 4.30 de AWS, por lo que se elige Microsoft Azure.</w:t>
+        <w:t>Resultado: Azure obtiene 4,60 puntos frente a 4,30 de AWS, por lo que se elige Microsoft Azure.</w:t>
       </w:r>
     </w:p>
     <w:p>

</xml_diff>

<commit_message>
Actualiza el documento con el equipo, costos en COP y nuevos diagramas
</commit_message>
<xml_diff>
--- a/documentacion/Documento_Arquitectura_Medical_Health.docx
+++ b/documentacion/Documento_Arquitectura_Medical_Health.docx
@@ -87,8 +87,8 @@
         <w:tblLook w:firstColumn="1" w:firstRow="1" w:lastColumn="0" w:lastRow="0" w:noHBand="0" w:noVBand="1" w:val="04A0"/>
       </w:tblPr>
       <w:tblGrid>
-        <w:gridCol w:w="4608"/>
-        <w:gridCol w:w="4320"/>
+        <w:gridCol w:w="3744"/>
+        <w:gridCol w:w="5184"/>
       </w:tblGrid>
       <w:tr>
         <w:trPr>
@@ -97,7 +97,7 @@
         </w:trPr>
         <w:tc>
           <w:tcPr>
-            <w:tcW w:type="dxa" w:w="4608"/>
+            <w:tcW w:type="dxa" w:w="3744"/>
             <w:shd w:val="clear" w:color="auto" w:fill="0B3C5D"/>
           </w:tcPr>
           <w:p>
@@ -109,7 +109,7 @@
               <w:rPr>
                 <w:b/>
                 <w:color w:val="FFFFFF"/>
-                <w:sz w:val="20"/>
+                <w:sz w:val="21"/>
               </w:rPr>
               <w:t>Integrante</w:t>
             </w:r>
@@ -117,7 +117,7 @@
         </w:tc>
         <w:tc>
           <w:tcPr>
-            <w:tcW w:type="dxa" w:w="4320"/>
+            <w:tcW w:type="dxa" w:w="5184"/>
             <w:shd w:val="clear" w:color="auto" w:fill="0B3C5D"/>
           </w:tcPr>
           <w:p>
@@ -129,7 +129,7 @@
               <w:rPr>
                 <w:b/>
                 <w:color w:val="FFFFFF"/>
-                <w:sz w:val="20"/>
+                <w:sz w:val="21"/>
               </w:rPr>
               <w:t>Rol</w:t>
             </w:r>
@@ -142,35 +142,35 @@
         </w:trPr>
         <w:tc>
           <w:tcPr>
-            <w:tcW w:type="dxa" w:w="4608"/>
-          </w:tcPr>
-          <w:p>
-            <w:pPr>
-              <w:spacing w:after="40" w:before="40" w:line="240" w:lineRule="auto"/>
-            </w:pPr>
-            <w:r/>
-            <w:r>
-              <w:rPr>
-                <w:sz w:val="20"/>
-              </w:rPr>
-              <w:t>______________________________</w:t>
-            </w:r>
-          </w:p>
-        </w:tc>
-        <w:tc>
-          <w:tcPr>
-            <w:tcW w:type="dxa" w:w="4320"/>
-          </w:tcPr>
-          <w:p>
-            <w:pPr>
-              <w:spacing w:after="40" w:before="40" w:line="240" w:lineRule="auto"/>
-            </w:pPr>
-            <w:r/>
-            <w:r>
-              <w:rPr>
-                <w:sz w:val="20"/>
-              </w:rPr>
-              <w:t>Arquitecto(a) de soluciones</w:t>
+            <w:tcW w:type="dxa" w:w="3744"/>
+          </w:tcPr>
+          <w:p>
+            <w:pPr>
+              <w:spacing w:after="40" w:before="40" w:line="240" w:lineRule="auto"/>
+            </w:pPr>
+            <w:r/>
+            <w:r>
+              <w:rPr>
+                <w:sz w:val="21"/>
+              </w:rPr>
+              <w:t>Yomaira Pardo Pajaro</w:t>
+            </w:r>
+          </w:p>
+        </w:tc>
+        <w:tc>
+          <w:tcPr>
+            <w:tcW w:type="dxa" w:w="5184"/>
+          </w:tcPr>
+          <w:p>
+            <w:pPr>
+              <w:spacing w:after="40" w:before="40" w:line="240" w:lineRule="auto"/>
+            </w:pPr>
+            <w:r/>
+            <w:r>
+              <w:rPr>
+                <w:sz w:val="21"/>
+              </w:rPr>
+              <w:t>Arquitecta de soluciones y líder de la presentación</w:t>
             </w:r>
           </w:p>
         </w:tc>
@@ -181,7 +181,7 @@
         </w:trPr>
         <w:tc>
           <w:tcPr>
-            <w:tcW w:type="dxa" w:w="4608"/>
+            <w:tcW w:type="dxa" w:w="3744"/>
             <w:shd w:val="clear" w:color="auto" w:fill="EAF2FB"/>
           </w:tcPr>
           <w:p>
@@ -191,15 +191,15 @@
             <w:r/>
             <w:r>
               <w:rPr>
-                <w:sz w:val="20"/>
-              </w:rPr>
-              <w:t>______________________________</w:t>
-            </w:r>
-          </w:p>
-        </w:tc>
-        <w:tc>
-          <w:tcPr>
-            <w:tcW w:type="dxa" w:w="4320"/>
+                <w:sz w:val="21"/>
+              </w:rPr>
+              <w:t>Sebastian Aparicio</w:t>
+            </w:r>
+          </w:p>
+        </w:tc>
+        <w:tc>
+          <w:tcPr>
+            <w:tcW w:type="dxa" w:w="5184"/>
             <w:shd w:val="clear" w:color="auto" w:fill="EAF2FB"/>
           </w:tcPr>
           <w:p>
@@ -209,9 +209,9 @@
             <w:r/>
             <w:r>
               <w:rPr>
-                <w:sz w:val="20"/>
-              </w:rPr>
-              <w:t>Ingeniero(a) cloud y DevOps</w:t>
+                <w:sz w:val="21"/>
+              </w:rPr>
+              <w:t>Ingeniero cloud, DevOps y seguridad</w:t>
             </w:r>
           </w:p>
         </w:tc>
@@ -222,115 +222,35 @@
         </w:trPr>
         <w:tc>
           <w:tcPr>
-            <w:tcW w:type="dxa" w:w="4608"/>
-          </w:tcPr>
-          <w:p>
-            <w:pPr>
-              <w:spacing w:after="40" w:before="40" w:line="240" w:lineRule="auto"/>
-            </w:pPr>
-            <w:r/>
-            <w:r>
-              <w:rPr>
-                <w:sz w:val="20"/>
-              </w:rPr>
-              <w:t>______________________________</w:t>
-            </w:r>
-          </w:p>
-        </w:tc>
-        <w:tc>
-          <w:tcPr>
-            <w:tcW w:type="dxa" w:w="4320"/>
-          </w:tcPr>
-          <w:p>
-            <w:pPr>
-              <w:spacing w:after="40" w:before="40" w:line="240" w:lineRule="auto"/>
-            </w:pPr>
-            <w:r/>
-            <w:r>
-              <w:rPr>
-                <w:sz w:val="20"/>
-              </w:rPr>
-              <w:t>Especialista en seguridad</w:t>
-            </w:r>
-          </w:p>
-        </w:tc>
-      </w:tr>
-      <w:tr>
-        <w:trPr>
-          <w:cantSplit w:val="true"/>
-        </w:trPr>
-        <w:tc>
-          <w:tcPr>
-            <w:tcW w:type="dxa" w:w="4608"/>
-            <w:shd w:val="clear" w:color="auto" w:fill="EAF2FB"/>
-          </w:tcPr>
-          <w:p>
-            <w:pPr>
-              <w:spacing w:after="40" w:before="40" w:line="240" w:lineRule="auto"/>
-            </w:pPr>
-            <w:r/>
-            <w:r>
-              <w:rPr>
-                <w:sz w:val="20"/>
-              </w:rPr>
-              <w:t>______________________________</w:t>
-            </w:r>
-          </w:p>
-        </w:tc>
-        <w:tc>
-          <w:tcPr>
-            <w:tcW w:type="dxa" w:w="4320"/>
-            <w:shd w:val="clear" w:color="auto" w:fill="EAF2FB"/>
-          </w:tcPr>
-          <w:p>
-            <w:pPr>
-              <w:spacing w:after="40" w:before="40" w:line="240" w:lineRule="auto"/>
-            </w:pPr>
-            <w:r/>
-            <w:r>
-              <w:rPr>
-                <w:sz w:val="20"/>
-              </w:rPr>
-              <w:t>Analista de costos (FinOps)</w:t>
-            </w:r>
-          </w:p>
-        </w:tc>
-      </w:tr>
-      <w:tr>
-        <w:trPr>
-          <w:cantSplit w:val="true"/>
-        </w:trPr>
-        <w:tc>
-          <w:tcPr>
-            <w:tcW w:type="dxa" w:w="4608"/>
-          </w:tcPr>
-          <w:p>
-            <w:pPr>
-              <w:spacing w:after="40" w:before="40" w:line="240" w:lineRule="auto"/>
-            </w:pPr>
-            <w:r/>
-            <w:r>
-              <w:rPr>
-                <w:sz w:val="20"/>
-              </w:rPr>
-              <w:t>______________________________</w:t>
-            </w:r>
-          </w:p>
-        </w:tc>
-        <w:tc>
-          <w:tcPr>
-            <w:tcW w:type="dxa" w:w="4320"/>
-          </w:tcPr>
-          <w:p>
-            <w:pPr>
-              <w:spacing w:after="40" w:before="40" w:line="240" w:lineRule="auto"/>
-            </w:pPr>
-            <w:r/>
-            <w:r>
-              <w:rPr>
-                <w:sz w:val="20"/>
-              </w:rPr>
-              <w:t>Líder de presentación y documentación</w:t>
+            <w:tcW w:type="dxa" w:w="3744"/>
+          </w:tcPr>
+          <w:p>
+            <w:pPr>
+              <w:spacing w:after="40" w:before="40" w:line="240" w:lineRule="auto"/>
+            </w:pPr>
+            <w:r/>
+            <w:r>
+              <w:rPr>
+                <w:sz w:val="21"/>
+              </w:rPr>
+              <w:t>Liris Castillo</w:t>
+            </w:r>
+          </w:p>
+        </w:tc>
+        <w:tc>
+          <w:tcPr>
+            <w:tcW w:type="dxa" w:w="5184"/>
+          </w:tcPr>
+          <w:p>
+            <w:pPr>
+              <w:spacing w:after="40" w:before="40" w:line="240" w:lineRule="auto"/>
+            </w:pPr>
+            <w:r/>
+            <w:r>
+              <w:rPr>
+                <w:sz w:val="21"/>
+              </w:rPr>
+              <w:t>Analista de costos (FinOps) y documentación</w:t>
             </w:r>
           </w:p>
         </w:tc>
@@ -505,7 +425,7 @@
         </w:rPr>
         <w:t>7.2 Diagrama de contenedores</w:t>
         <w:tab/>
-        <w:t>9</w:t>
+        <w:t>7</w:t>
       </w:r>
     </w:p>
     <w:p>
@@ -522,7 +442,7 @@
         </w:rPr>
         <w:t>7.3 Diagramas de componentes</w:t>
         <w:tab/>
-        <w:t>11</w:t>
+        <w:t>8</w:t>
       </w:r>
     </w:p>
     <w:p>
@@ -539,7 +459,7 @@
         </w:rPr>
         <w:t>7.4 Diagrama de código (opcional)</w:t>
         <w:tab/>
-        <w:t>15</w:t>
+        <w:t>11</w:t>
       </w:r>
     </w:p>
     <w:p>
@@ -556,7 +476,7 @@
         </w:rPr>
         <w:t>7.5 Flujo de una atención</w:t>
         <w:tab/>
-        <w:t>16</w:t>
+        <w:t>12</w:t>
       </w:r>
     </w:p>
     <w:p>
@@ -572,7 +492,7 @@
         </w:rPr>
         <w:t>8. Arquitectura en la nube</w:t>
         <w:tab/>
-        <w:t>17</w:t>
+        <w:t>13</w:t>
       </w:r>
     </w:p>
     <w:p>
@@ -588,7 +508,7 @@
         </w:rPr>
         <w:t>9. Seguridad</w:t>
         <w:tab/>
-        <w:t>18</w:t>
+        <w:t>14</w:t>
       </w:r>
     </w:p>
     <w:p>
@@ -604,7 +524,7 @@
         </w:rPr>
         <w:t>10. Alta disponibilidad y recuperación</w:t>
         <w:tab/>
-        <w:t>19</w:t>
+        <w:t>14</w:t>
       </w:r>
     </w:p>
     <w:p>
@@ -620,7 +540,7 @@
         </w:rPr>
         <w:t>11. Escalabilidad</w:t>
         <w:tab/>
-        <w:t>19</w:t>
+        <w:t>15</w:t>
       </w:r>
     </w:p>
     <w:p>
@@ -636,7 +556,7 @@
         </w:rPr>
         <w:t>12. Monitoreo y logs</w:t>
         <w:tab/>
-        <w:t>19</w:t>
+        <w:t>15</w:t>
       </w:r>
     </w:p>
     <w:p>
@@ -652,7 +572,7 @@
         </w:rPr>
         <w:t>13. Comparación de plataformas y justificación</w:t>
         <w:tab/>
-        <w:t>21</w:t>
+        <w:t>16</w:t>
       </w:r>
     </w:p>
     <w:p>
@@ -668,7 +588,7 @@
         </w:rPr>
         <w:t>14. Estimación de costos</w:t>
         <w:tab/>
-        <w:t>21</w:t>
+        <w:t>16</w:t>
       </w:r>
     </w:p>
     <w:p>
@@ -684,7 +604,7 @@
         </w:rPr>
         <w:t>15. Plan de implementación y cronograma</w:t>
         <w:tab/>
-        <w:t>23</w:t>
+        <w:t>18</w:t>
       </w:r>
     </w:p>
     <w:p>
@@ -700,7 +620,7 @@
         </w:rPr>
         <w:t>16. Riesgos y mitigaciones</w:t>
         <w:tab/>
-        <w:t>23</w:t>
+        <w:t>18</w:t>
       </w:r>
     </w:p>
     <w:p>
@@ -716,7 +636,7 @@
         </w:rPr>
         <w:t>17. Conclusiones</w:t>
         <w:tab/>
-        <w:t>24</w:t>
+        <w:t>19</w:t>
       </w:r>
     </w:p>
     <w:p>
@@ -732,7 +652,7 @@
         </w:rPr>
         <w:t>Referencias</w:t>
         <w:tab/>
-        <w:t>24</w:t>
+        <w:t>19</w:t>
       </w:r>
     </w:p>
     <w:p>
@@ -1916,7 +1836,7 @@
         <w:rPr>
           <w:i w:val="0"/>
         </w:rPr>
-        <w:t>El equipo está conformado por cinco integrantes. Cada rol es responsable de un entregable, pero todas las decisiones se revisan en conjunto.</w:t>
+        <w:t>El equipo está conformado por tres integrantes. Cada uno lidera uno o más entregables, pero todas las decisiones se revisan en conjunto.</w:t>
       </w:r>
     </w:p>
     <w:tbl>
@@ -1928,9 +1848,9 @@
         <w:tblLook w:firstColumn="1" w:firstRow="1" w:lastColumn="0" w:lastRow="0" w:noHBand="0" w:noVBand="1" w:val="04A0"/>
       </w:tblPr>
       <w:tblGrid>
-        <w:gridCol w:w="2592"/>
-        <w:gridCol w:w="4896"/>
-        <w:gridCol w:w="1872"/>
+        <w:gridCol w:w="2304"/>
+        <w:gridCol w:w="2736"/>
+        <w:gridCol w:w="4320"/>
       </w:tblGrid>
       <w:tr>
         <w:trPr>
@@ -1939,7 +1859,7 @@
         </w:trPr>
         <w:tc>
           <w:tcPr>
-            <w:tcW w:type="dxa" w:w="2592"/>
+            <w:tcW w:type="dxa" w:w="2304"/>
             <w:shd w:val="clear" w:color="auto" w:fill="0B3C5D"/>
           </w:tcPr>
           <w:p>
@@ -1953,13 +1873,13 @@
                 <w:color w:val="FFFFFF"/>
                 <w:sz w:val="19"/>
               </w:rPr>
-              <w:t>Rol</w:t>
-            </w:r>
-          </w:p>
-        </w:tc>
-        <w:tc>
-          <w:tcPr>
-            <w:tcW w:type="dxa" w:w="4896"/>
+              <w:t>Integrante</w:t>
+            </w:r>
+          </w:p>
+        </w:tc>
+        <w:tc>
+          <w:tcPr>
+            <w:tcW w:type="dxa" w:w="2736"/>
             <w:shd w:val="clear" w:color="auto" w:fill="0B3C5D"/>
           </w:tcPr>
           <w:p>
@@ -1973,13 +1893,13 @@
                 <w:color w:val="FFFFFF"/>
                 <w:sz w:val="19"/>
               </w:rPr>
-              <w:t>Responsabilidades</w:t>
-            </w:r>
-          </w:p>
-        </w:tc>
-        <w:tc>
-          <w:tcPr>
-            <w:tcW w:type="dxa" w:w="1872"/>
+              <w:t>Rol</w:t>
+            </w:r>
+          </w:p>
+        </w:tc>
+        <w:tc>
+          <w:tcPr>
+            <w:tcW w:type="dxa" w:w="4320"/>
             <w:shd w:val="clear" w:color="auto" w:fill="0B3C5D"/>
           </w:tcPr>
           <w:p>
@@ -1993,7 +1913,7 @@
                 <w:color w:val="FFFFFF"/>
                 <w:sz w:val="19"/>
               </w:rPr>
-              <w:t>Integrante</w:t>
+              <w:t>Responsabilidades</w:t>
             </w:r>
           </w:p>
         </w:tc>
@@ -2004,7 +1924,7 @@
         </w:trPr>
         <w:tc>
           <w:tcPr>
-            <w:tcW w:type="dxa" w:w="2592"/>
+            <w:tcW w:type="dxa" w:w="2304"/>
           </w:tcPr>
           <w:p>
             <w:pPr>
@@ -2015,13 +1935,13 @@
               <w:rPr>
                 <w:sz w:val="19"/>
               </w:rPr>
-              <w:t>Arquitecto(a) de soluciones</w:t>
-            </w:r>
-          </w:p>
-        </w:tc>
-        <w:tc>
-          <w:tcPr>
-            <w:tcW w:type="dxa" w:w="4896"/>
+              <w:t>Yomaira Pardo Pajaro</w:t>
+            </w:r>
+          </w:p>
+        </w:tc>
+        <w:tc>
+          <w:tcPr>
+            <w:tcW w:type="dxa" w:w="2736"/>
           </w:tcPr>
           <w:p>
             <w:pPr>
@@ -2032,13 +1952,13 @@
               <w:rPr>
                 <w:sz w:val="19"/>
               </w:rPr>
-              <w:t>Define la arquitectura, coordina las decisiones técnicas y elabora los diagramas C4.</w:t>
-            </w:r>
-          </w:p>
-        </w:tc>
-        <w:tc>
-          <w:tcPr>
-            <w:tcW w:type="dxa" w:w="1872"/>
+              <w:t>Arquitecta de soluciones y líder de la presentación</w:t>
+            </w:r>
+          </w:p>
+        </w:tc>
+        <w:tc>
+          <w:tcPr>
+            <w:tcW w:type="dxa" w:w="4320"/>
           </w:tcPr>
           <w:p>
             <w:pPr>
@@ -2049,6 +1969,7 @@
               <w:rPr>
                 <w:sz w:val="19"/>
               </w:rPr>
+              <w:t>Define la arquitectura, elabora los diagramas C4, integra el documento y coordina la presentación.</w:t>
             </w:r>
           </w:p>
         </w:tc>
@@ -2059,7 +1980,7 @@
         </w:trPr>
         <w:tc>
           <w:tcPr>
-            <w:tcW w:type="dxa" w:w="2592"/>
+            <w:tcW w:type="dxa" w:w="2304"/>
             <w:shd w:val="clear" w:color="auto" w:fill="EAF2FB"/>
           </w:tcPr>
           <w:p>
@@ -2071,13 +1992,13 @@
               <w:rPr>
                 <w:sz w:val="19"/>
               </w:rPr>
-              <w:t>Ingeniero(a) cloud y DevOps</w:t>
-            </w:r>
-          </w:p>
-        </w:tc>
-        <w:tc>
-          <w:tcPr>
-            <w:tcW w:type="dxa" w:w="4896"/>
+              <w:t>Sebastian Aparicio</w:t>
+            </w:r>
+          </w:p>
+        </w:tc>
+        <w:tc>
+          <w:tcPr>
+            <w:tcW w:type="dxa" w:w="2736"/>
             <w:shd w:val="clear" w:color="auto" w:fill="EAF2FB"/>
           </w:tcPr>
           <w:p>
@@ -2089,13 +2010,13 @@
               <w:rPr>
                 <w:sz w:val="19"/>
               </w:rPr>
-              <w:t>Diseña la infraestructura en Azure, el diagrama de nube, la alta disponibilidad y el CI/CD.</w:t>
-            </w:r>
-          </w:p>
-        </w:tc>
-        <w:tc>
-          <w:tcPr>
-            <w:tcW w:type="dxa" w:w="1872"/>
+              <w:t>Ingeniero cloud, DevOps y seguridad</w:t>
+            </w:r>
+          </w:p>
+        </w:tc>
+        <w:tc>
+          <w:tcPr>
+            <w:tcW w:type="dxa" w:w="4320"/>
             <w:shd w:val="clear" w:color="auto" w:fill="EAF2FB"/>
           </w:tcPr>
           <w:p>
@@ -2107,6 +2028,7 @@
               <w:rPr>
                 <w:sz w:val="19"/>
               </w:rPr>
+              <w:t>Diseña la infraestructura en Azure, la alta disponibilidad, el CI/CD, la autenticación OIDC y el cumplimiento.</w:t>
             </w:r>
           </w:p>
         </w:tc>
@@ -2117,7 +2039,7 @@
         </w:trPr>
         <w:tc>
           <w:tcPr>
-            <w:tcW w:type="dxa" w:w="2592"/>
+            <w:tcW w:type="dxa" w:w="2304"/>
           </w:tcPr>
           <w:p>
             <w:pPr>
@@ -2128,13 +2050,13 @@
               <w:rPr>
                 <w:sz w:val="19"/>
               </w:rPr>
-              <w:t>Especialista en seguridad</w:t>
-            </w:r>
-          </w:p>
-        </w:tc>
-        <w:tc>
-          <w:tcPr>
-            <w:tcW w:type="dxa" w:w="4896"/>
+              <w:t>Liris Castillo</w:t>
+            </w:r>
+          </w:p>
+        </w:tc>
+        <w:tc>
+          <w:tcPr>
+            <w:tcW w:type="dxa" w:w="2736"/>
           </w:tcPr>
           <w:p>
             <w:pPr>
@@ -2145,13 +2067,13 @@
               <w:rPr>
                 <w:sz w:val="19"/>
               </w:rPr>
-              <w:t>Diseña la autenticación OIDC, el control de acceso, el cifrado y el cumplimiento normativo.</w:t>
-            </w:r>
-          </w:p>
-        </w:tc>
-        <w:tc>
-          <w:tcPr>
-            <w:tcW w:type="dxa" w:w="1872"/>
+              <w:t>Analista de costos (FinOps) y documentación</w:t>
+            </w:r>
+          </w:p>
+        </w:tc>
+        <w:tc>
+          <w:tcPr>
+            <w:tcW w:type="dxa" w:w="4320"/>
           </w:tcPr>
           <w:p>
             <w:pPr>
@@ -2162,119 +2084,7 @@
               <w:rPr>
                 <w:sz w:val="19"/>
               </w:rPr>
-            </w:r>
-          </w:p>
-        </w:tc>
-      </w:tr>
-      <w:tr>
-        <w:trPr>
-          <w:cantSplit w:val="true"/>
-        </w:trPr>
-        <w:tc>
-          <w:tcPr>
-            <w:tcW w:type="dxa" w:w="2592"/>
-            <w:shd w:val="clear" w:color="auto" w:fill="EAF2FB"/>
-          </w:tcPr>
-          <w:p>
-            <w:pPr>
-              <w:spacing w:after="40" w:before="40" w:line="240" w:lineRule="auto"/>
-            </w:pPr>
-            <w:r/>
-            <w:r>
-              <w:rPr>
-                <w:sz w:val="19"/>
-              </w:rPr>
-              <w:t>Analista de costos (FinOps)</w:t>
-            </w:r>
-          </w:p>
-        </w:tc>
-        <w:tc>
-          <w:tcPr>
-            <w:tcW w:type="dxa" w:w="4896"/>
-            <w:shd w:val="clear" w:color="auto" w:fill="EAF2FB"/>
-          </w:tcPr>
-          <w:p>
-            <w:pPr>
-              <w:spacing w:after="40" w:before="40" w:line="240" w:lineRule="auto"/>
-            </w:pPr>
-            <w:r/>
-            <w:r>
-              <w:rPr>
-                <w:sz w:val="19"/>
-              </w:rPr>
-              <w:t>Elabora la estimación de costos, la comparación de plataformas y las propuestas de ahorro.</w:t>
-            </w:r>
-          </w:p>
-        </w:tc>
-        <w:tc>
-          <w:tcPr>
-            <w:tcW w:type="dxa" w:w="1872"/>
-            <w:shd w:val="clear" w:color="auto" w:fill="EAF2FB"/>
-          </w:tcPr>
-          <w:p>
-            <w:pPr>
-              <w:spacing w:after="40" w:before="40" w:line="240" w:lineRule="auto"/>
-            </w:pPr>
-            <w:r/>
-            <w:r>
-              <w:rPr>
-                <w:sz w:val="19"/>
-              </w:rPr>
-            </w:r>
-          </w:p>
-        </w:tc>
-      </w:tr>
-      <w:tr>
-        <w:trPr>
-          <w:cantSplit w:val="true"/>
-        </w:trPr>
-        <w:tc>
-          <w:tcPr>
-            <w:tcW w:type="dxa" w:w="2592"/>
-          </w:tcPr>
-          <w:p>
-            <w:pPr>
-              <w:spacing w:after="40" w:before="40" w:line="240" w:lineRule="auto"/>
-            </w:pPr>
-            <w:r/>
-            <w:r>
-              <w:rPr>
-                <w:sz w:val="19"/>
-              </w:rPr>
-              <w:t>Líder de presentación y documentación</w:t>
-            </w:r>
-          </w:p>
-        </w:tc>
-        <w:tc>
-          <w:tcPr>
-            <w:tcW w:type="dxa" w:w="4896"/>
-          </w:tcPr>
-          <w:p>
-            <w:pPr>
-              <w:spacing w:after="40" w:before="40" w:line="240" w:lineRule="auto"/>
-            </w:pPr>
-            <w:r/>
-            <w:r>
-              <w:rPr>
-                <w:sz w:val="19"/>
-              </w:rPr>
-              <w:t>Integra el documento final, prepara la presentación y coordina los ensayos.</w:t>
-            </w:r>
-          </w:p>
-        </w:tc>
-        <w:tc>
-          <w:tcPr>
-            <w:tcW w:type="dxa" w:w="1872"/>
-          </w:tcPr>
-          <w:p>
-            <w:pPr>
-              <w:spacing w:after="40" w:before="40" w:line="240" w:lineRule="auto"/>
-            </w:pPr>
-            <w:r/>
-            <w:r>
-              <w:rPr>
-                <w:sz w:val="19"/>
-              </w:rPr>
+              <w:t>Elabora la estimación de costos, la comparación de plataformas y las propuestas de ahorro, y apoya la documentación.</w:t>
             </w:r>
           </w:p>
         </w:tc>
@@ -2551,7 +2361,7 @@
       <w:r>
         <w:drawing>
           <wp:inline xmlns:a="http://schemas.openxmlformats.org/drawingml/2006/main" xmlns:pic="http://schemas.openxmlformats.org/drawingml/2006/picture">
-            <wp:extent cx="5943600" cy="4814013"/>
+            <wp:extent cx="5943600" cy="2145458"/>
             <wp:docPr id="1" name="Picture 1"/>
             <wp:cNvGraphicFramePr>
               <a:graphicFrameLocks noChangeAspect="1"/>
@@ -2572,7 +2382,7 @@
                   <pic:spPr>
                     <a:xfrm>
                       <a:off x="0" y="0"/>
-                      <a:ext cx="5943600" cy="4814013"/>
+                      <a:ext cx="5943600" cy="2145458"/>
                     </a:xfrm>
                     <a:prstGeom prst="rect"/>
                   </pic:spPr>
@@ -3193,11 +3003,6 @@
     </w:tbl>
     <w:p/>
     <w:p>
-      <w:r>
-        <w:br w:type="page"/>
-      </w:r>
-    </w:p>
-    <w:p>
       <w:pPr>
         <w:pStyle w:val="Heading2"/>
       </w:pPr>
@@ -3220,7 +3025,7 @@
       <w:r>
         <w:drawing>
           <wp:inline xmlns:a="http://schemas.openxmlformats.org/drawingml/2006/main" xmlns:pic="http://schemas.openxmlformats.org/drawingml/2006/picture">
-            <wp:extent cx="5943600" cy="6034573"/>
+            <wp:extent cx="5943600" cy="2751947"/>
             <wp:docPr id="2" name="Picture 2"/>
             <wp:cNvGraphicFramePr>
               <a:graphicFrameLocks noChangeAspect="1"/>
@@ -3241,7 +3046,7 @@
                   <pic:spPr>
                     <a:xfrm>
                       <a:off x="0" y="0"/>
-                      <a:ext cx="5943600" cy="6034573"/>
+                      <a:ext cx="5943600" cy="2751947"/>
                     </a:xfrm>
                     <a:prstGeom prst="rect"/>
                   </pic:spPr>
@@ -4036,11 +3841,6 @@
     </w:tbl>
     <w:p/>
     <w:p>
-      <w:r>
-        <w:br w:type="page"/>
-      </w:r>
-    </w:p>
-    <w:p>
       <w:pPr>
         <w:pStyle w:val="Heading2"/>
       </w:pPr>
@@ -4079,7 +3879,7 @@
       <w:r>
         <w:drawing>
           <wp:inline xmlns:a="http://schemas.openxmlformats.org/drawingml/2006/main" xmlns:pic="http://schemas.openxmlformats.org/drawingml/2006/picture">
-            <wp:extent cx="5943600" cy="5329529"/>
+            <wp:extent cx="5943600" cy="2842921"/>
             <wp:docPr id="3" name="Picture 3"/>
             <wp:cNvGraphicFramePr>
               <a:graphicFrameLocks noChangeAspect="1"/>
@@ -4100,7 +3900,7 @@
                   <pic:spPr>
                     <a:xfrm>
                       <a:off x="0" y="0"/>
-                      <a:ext cx="5943600" cy="5329529"/>
+                      <a:ext cx="5943600" cy="2842921"/>
                     </a:xfrm>
                     <a:prstGeom prst="rect"/>
                   </pic:spPr>
@@ -4146,7 +3946,7 @@
       <w:r>
         <w:drawing>
           <wp:inline xmlns:a="http://schemas.openxmlformats.org/drawingml/2006/main" xmlns:pic="http://schemas.openxmlformats.org/drawingml/2006/picture">
-            <wp:extent cx="3747742" cy="6400799"/>
+            <wp:extent cx="5943600" cy="1311534"/>
             <wp:docPr id="4" name="Picture 4"/>
             <wp:cNvGraphicFramePr>
               <a:graphicFrameLocks noChangeAspect="1"/>
@@ -4167,7 +3967,7 @@
                   <pic:spPr>
                     <a:xfrm>
                       <a:off x="0" y="0"/>
-                      <a:ext cx="3747742" cy="6400799"/>
+                      <a:ext cx="5943600" cy="1311534"/>
                     </a:xfrm>
                     <a:prstGeom prst="rect"/>
                   </pic:spPr>
@@ -4213,7 +4013,7 @@
       <w:r>
         <w:drawing>
           <wp:inline xmlns:a="http://schemas.openxmlformats.org/drawingml/2006/main" xmlns:pic="http://schemas.openxmlformats.org/drawingml/2006/picture">
-            <wp:extent cx="5943600" cy="5200650"/>
+            <wp:extent cx="5943600" cy="2319823"/>
             <wp:docPr id="5" name="Picture 5"/>
             <wp:cNvGraphicFramePr>
               <a:graphicFrameLocks noChangeAspect="1"/>
@@ -4234,7 +4034,7 @@
                   <pic:spPr>
                     <a:xfrm>
                       <a:off x="0" y="0"/>
-                      <a:ext cx="5943600" cy="5200650"/>
+                      <a:ext cx="5943600" cy="2319823"/>
                     </a:xfrm>
                     <a:prstGeom prst="rect"/>
                   </pic:spPr>
@@ -4280,7 +4080,7 @@
       <w:r>
         <w:drawing>
           <wp:inline xmlns:a="http://schemas.openxmlformats.org/drawingml/2006/main" xmlns:pic="http://schemas.openxmlformats.org/drawingml/2006/picture">
-            <wp:extent cx="5943600" cy="6390886"/>
+            <wp:extent cx="5943600" cy="2190944"/>
             <wp:docPr id="6" name="Picture 6"/>
             <wp:cNvGraphicFramePr>
               <a:graphicFrameLocks noChangeAspect="1"/>
@@ -4301,7 +4101,7 @@
                   <pic:spPr>
                     <a:xfrm>
                       <a:off x="0" y="0"/>
-                      <a:ext cx="5943600" cy="6390886"/>
+                      <a:ext cx="5943600" cy="2190944"/>
                     </a:xfrm>
                     <a:prstGeom prst="rect"/>
                   </pic:spPr>
@@ -4420,7 +4220,7 @@
         <w:rPr>
           <w:i w:val="0"/>
         </w:rPr>
-        <w:t>El diagrama de secuencia recorre una llamada completa: inicio de sesión, consulta de la historia, triaje, búsqueda de centros y remisión.</w:t>
+        <w:t>El flujo resume una llamada completa en siete pasos. Cada paso usa uno de los microservicios de las historias de usuario.</w:t>
       </w:r>
     </w:p>
     <w:p>
@@ -4430,7 +4230,7 @@
       <w:r>
         <w:drawing>
           <wp:inline xmlns:a="http://schemas.openxmlformats.org/drawingml/2006/main" xmlns:pic="http://schemas.openxmlformats.org/drawingml/2006/picture">
-            <wp:extent cx="8595360" cy="4681401"/>
+            <wp:extent cx="8595360" cy="1293689"/>
             <wp:docPr id="8" name="Picture 8"/>
             <wp:cNvGraphicFramePr>
               <a:graphicFrameLocks noChangeAspect="1"/>
@@ -4439,7 +4239,7 @@
               <a:graphicData uri="http://schemas.openxmlformats.org/drawingml/2006/picture">
                 <pic:pic>
                   <pic:nvPicPr>
-                    <pic:cNvPr id="0" name="06-secuencia-atencion.png"/>
+                    <pic:cNvPr id="0" name="06-flujo-atencion.png"/>
                     <pic:cNvPicPr/>
                   </pic:nvPicPr>
                   <pic:blipFill>
@@ -4451,7 +4251,7 @@
                   <pic:spPr>
                     <a:xfrm>
                       <a:off x="0" y="0"/>
-                      <a:ext cx="8595360" cy="4681401"/>
+                      <a:ext cx="8595360" cy="1293689"/>
                     </a:xfrm>
                     <a:prstGeom prst="rect"/>
                   </pic:spPr>
@@ -4471,9 +4271,491 @@
           <w:i/>
           <w:sz w:val="18"/>
         </w:rPr>
-        <w:t>Figura 8. Secuencia de una atención de principio a fin.</w:t>
+        <w:t>Figura 8. Flujo de una atención de principio a fin.</w:t>
       </w:r>
     </w:p>
+    <w:tbl>
+      <w:tblPr>
+        <w:tblStyle w:val="TableGrid"/>
+        <w:tblW w:type="auto" w:w="0"/>
+        <w:jc w:val="center"/>
+        <w:tblLayout w:type="fixed"/>
+        <w:tblLook w:firstColumn="1" w:firstRow="1" w:lastColumn="0" w:lastRow="0" w:noHBand="0" w:noVBand="1" w:val="04A0"/>
+      </w:tblPr>
+      <w:tblGrid>
+        <w:gridCol w:w="864"/>
+        <w:gridCol w:w="4320"/>
+        <w:gridCol w:w="8352"/>
+      </w:tblGrid>
+      <w:tr>
+        <w:trPr>
+          <w:cantSplit w:val="true"/>
+          <w:tblHeader w:val="true"/>
+        </w:trPr>
+        <w:tc>
+          <w:tcPr>
+            <w:tcW w:type="dxa" w:w="864"/>
+            <w:shd w:val="clear" w:color="auto" w:fill="0B3C5D"/>
+          </w:tcPr>
+          <w:p>
+            <w:pPr>
+              <w:spacing w:after="40" w:before="40" w:line="240" w:lineRule="auto"/>
+            </w:pPr>
+            <w:r/>
+            <w:r>
+              <w:rPr>
+                <w:b/>
+                <w:color w:val="FFFFFF"/>
+                <w:sz w:val="20"/>
+              </w:rPr>
+              <w:t>Paso</w:t>
+            </w:r>
+          </w:p>
+        </w:tc>
+        <w:tc>
+          <w:tcPr>
+            <w:tcW w:type="dxa" w:w="4320"/>
+            <w:shd w:val="clear" w:color="auto" w:fill="0B3C5D"/>
+          </w:tcPr>
+          <w:p>
+            <w:pPr>
+              <w:spacing w:after="40" w:before="40" w:line="240" w:lineRule="auto"/>
+            </w:pPr>
+            <w:r/>
+            <w:r>
+              <w:rPr>
+                <w:b/>
+                <w:color w:val="FFFFFF"/>
+                <w:sz w:val="20"/>
+              </w:rPr>
+              <w:t>Qué hace la enfermera</w:t>
+            </w:r>
+          </w:p>
+        </w:tc>
+        <w:tc>
+          <w:tcPr>
+            <w:tcW w:type="dxa" w:w="8352"/>
+            <w:shd w:val="clear" w:color="auto" w:fill="0B3C5D"/>
+          </w:tcPr>
+          <w:p>
+            <w:pPr>
+              <w:spacing w:after="40" w:before="40" w:line="240" w:lineRule="auto"/>
+            </w:pPr>
+            <w:r/>
+            <w:r>
+              <w:rPr>
+                <w:b/>
+                <w:color w:val="FFFFFF"/>
+                <w:sz w:val="20"/>
+              </w:rPr>
+              <w:t>Qué hace el sistema</w:t>
+            </w:r>
+          </w:p>
+        </w:tc>
+      </w:tr>
+      <w:tr>
+        <w:trPr>
+          <w:cantSplit w:val="true"/>
+        </w:trPr>
+        <w:tc>
+          <w:tcPr>
+            <w:tcW w:type="dxa" w:w="864"/>
+          </w:tcPr>
+          <w:p>
+            <w:pPr>
+              <w:spacing w:after="40" w:before="40" w:line="240" w:lineRule="auto"/>
+            </w:pPr>
+            <w:r/>
+            <w:r>
+              <w:rPr>
+                <w:sz w:val="20"/>
+              </w:rPr>
+              <w:t>1</w:t>
+            </w:r>
+          </w:p>
+        </w:tc>
+        <w:tc>
+          <w:tcPr>
+            <w:tcW w:type="dxa" w:w="4320"/>
+          </w:tcPr>
+          <w:p>
+            <w:pPr>
+              <w:spacing w:after="40" w:before="40" w:line="240" w:lineRule="auto"/>
+            </w:pPr>
+            <w:r/>
+            <w:r>
+              <w:rPr>
+                <w:sz w:val="20"/>
+              </w:rPr>
+              <w:t>Inicia sesión</w:t>
+            </w:r>
+          </w:p>
+        </w:tc>
+        <w:tc>
+          <w:tcPr>
+            <w:tcW w:type="dxa" w:w="8352"/>
+          </w:tcPr>
+          <w:p>
+            <w:pPr>
+              <w:spacing w:after="40" w:before="40" w:line="240" w:lineRule="auto"/>
+            </w:pPr>
+            <w:r/>
+            <w:r>
+              <w:rPr>
+                <w:sz w:val="20"/>
+              </w:rPr>
+              <w:t>Redirige al sistema de seguridad corporativo (OIDC + MFA) y recibe un token con su rol.</w:t>
+            </w:r>
+          </w:p>
+        </w:tc>
+      </w:tr>
+      <w:tr>
+        <w:trPr>
+          <w:cantSplit w:val="true"/>
+        </w:trPr>
+        <w:tc>
+          <w:tcPr>
+            <w:tcW w:type="dxa" w:w="864"/>
+            <w:shd w:val="clear" w:color="auto" w:fill="EAF2FB"/>
+          </w:tcPr>
+          <w:p>
+            <w:pPr>
+              <w:spacing w:after="40" w:before="40" w:line="240" w:lineRule="auto"/>
+            </w:pPr>
+            <w:r/>
+            <w:r>
+              <w:rPr>
+                <w:sz w:val="20"/>
+              </w:rPr>
+              <w:t>2</w:t>
+            </w:r>
+          </w:p>
+        </w:tc>
+        <w:tc>
+          <w:tcPr>
+            <w:tcW w:type="dxa" w:w="4320"/>
+            <w:shd w:val="clear" w:color="auto" w:fill="EAF2FB"/>
+          </w:tcPr>
+          <w:p>
+            <w:pPr>
+              <w:spacing w:after="40" w:before="40" w:line="240" w:lineRule="auto"/>
+            </w:pPr>
+            <w:r/>
+            <w:r>
+              <w:rPr>
+                <w:sz w:val="20"/>
+              </w:rPr>
+              <w:t>Recibe la llamada del paciente</w:t>
+            </w:r>
+          </w:p>
+        </w:tc>
+        <w:tc>
+          <w:tcPr>
+            <w:tcW w:type="dxa" w:w="8352"/>
+            <w:shd w:val="clear" w:color="auto" w:fill="EAF2FB"/>
+          </w:tcPr>
+          <w:p>
+            <w:pPr>
+              <w:spacing w:after="40" w:before="40" w:line="240" w:lineRule="auto"/>
+            </w:pPr>
+            <w:r/>
+            <w:r>
+              <w:rPr>
+                <w:sz w:val="20"/>
+              </w:rPr>
+              <w:t>Abre un caso nuevo en el servicio de Llamadas y Casos.</w:t>
+            </w:r>
+          </w:p>
+        </w:tc>
+      </w:tr>
+      <w:tr>
+        <w:trPr>
+          <w:cantSplit w:val="true"/>
+        </w:trPr>
+        <w:tc>
+          <w:tcPr>
+            <w:tcW w:type="dxa" w:w="864"/>
+          </w:tcPr>
+          <w:p>
+            <w:pPr>
+              <w:spacing w:after="40" w:before="40" w:line="240" w:lineRule="auto"/>
+            </w:pPr>
+            <w:r/>
+            <w:r>
+              <w:rPr>
+                <w:sz w:val="20"/>
+              </w:rPr>
+              <w:t>3</w:t>
+            </w:r>
+          </w:p>
+        </w:tc>
+        <w:tc>
+          <w:tcPr>
+            <w:tcW w:type="dxa" w:w="4320"/>
+          </w:tcPr>
+          <w:p>
+            <w:pPr>
+              <w:spacing w:after="40" w:before="40" w:line="240" w:lineRule="auto"/>
+            </w:pPr>
+            <w:r/>
+            <w:r>
+              <w:rPr>
+                <w:sz w:val="20"/>
+              </w:rPr>
+              <w:t>Consulta la historia clínica (HU01)</w:t>
+            </w:r>
+          </w:p>
+        </w:tc>
+        <w:tc>
+          <w:tcPr>
+            <w:tcW w:type="dxa" w:w="8352"/>
+          </w:tcPr>
+          <w:p>
+            <w:pPr>
+              <w:spacing w:after="40" w:before="40" w:line="240" w:lineRule="auto"/>
+            </w:pPr>
+            <w:r/>
+            <w:r>
+              <w:rPr>
+                <w:sz w:val="20"/>
+              </w:rPr>
+              <w:t>Lee FHIR, arma el resumen clínico y registra la consulta en auditoría.</w:t>
+            </w:r>
+          </w:p>
+        </w:tc>
+      </w:tr>
+      <w:tr>
+        <w:trPr>
+          <w:cantSplit w:val="true"/>
+        </w:trPr>
+        <w:tc>
+          <w:tcPr>
+            <w:tcW w:type="dxa" w:w="864"/>
+            <w:shd w:val="clear" w:color="auto" w:fill="EAF2FB"/>
+          </w:tcPr>
+          <w:p>
+            <w:pPr>
+              <w:spacing w:after="40" w:before="40" w:line="240" w:lineRule="auto"/>
+            </w:pPr>
+            <w:r/>
+            <w:r>
+              <w:rPr>
+                <w:sz w:val="20"/>
+              </w:rPr>
+              <w:t>4</w:t>
+            </w:r>
+          </w:p>
+        </w:tc>
+        <w:tc>
+          <w:tcPr>
+            <w:tcW w:type="dxa" w:w="4320"/>
+            <w:shd w:val="clear" w:color="auto" w:fill="EAF2FB"/>
+          </w:tcPr>
+          <w:p>
+            <w:pPr>
+              <w:spacing w:after="40" w:before="40" w:line="240" w:lineRule="auto"/>
+            </w:pPr>
+            <w:r/>
+            <w:r>
+              <w:rPr>
+                <w:sz w:val="20"/>
+              </w:rPr>
+              <w:t>Registra los síntomas (HU02)</w:t>
+            </w:r>
+          </w:p>
+        </w:tc>
+        <w:tc>
+          <w:tcPr>
+            <w:tcW w:type="dxa" w:w="8352"/>
+            <w:shd w:val="clear" w:color="auto" w:fill="EAF2FB"/>
+          </w:tcPr>
+          <w:p>
+            <w:pPr>
+              <w:spacing w:after="40" w:before="40" w:line="240" w:lineRule="auto"/>
+            </w:pPr>
+            <w:r/>
+            <w:r>
+              <w:rPr>
+                <w:sz w:val="20"/>
+              </w:rPr>
+              <w:t>Aplica reglas clínicas, consulta el motor de apoyo con datos anonimizados y sugiere el nivel de urgencia.</w:t>
+            </w:r>
+          </w:p>
+        </w:tc>
+      </w:tr>
+      <w:tr>
+        <w:trPr>
+          <w:cantSplit w:val="true"/>
+        </w:trPr>
+        <w:tc>
+          <w:tcPr>
+            <w:tcW w:type="dxa" w:w="864"/>
+          </w:tcPr>
+          <w:p>
+            <w:pPr>
+              <w:spacing w:after="40" w:before="40" w:line="240" w:lineRule="auto"/>
+            </w:pPr>
+            <w:r/>
+            <w:r>
+              <w:rPr>
+                <w:sz w:val="20"/>
+              </w:rPr>
+              <w:t>5</w:t>
+            </w:r>
+          </w:p>
+        </w:tc>
+        <w:tc>
+          <w:tcPr>
+            <w:tcW w:type="dxa" w:w="4320"/>
+          </w:tcPr>
+          <w:p>
+            <w:pPr>
+              <w:spacing w:after="40" w:before="40" w:line="240" w:lineRule="auto"/>
+            </w:pPr>
+            <w:r/>
+            <w:r>
+              <w:rPr>
+                <w:sz w:val="20"/>
+              </w:rPr>
+              <w:t>Busca el centro más cercano (HU03)</w:t>
+            </w:r>
+          </w:p>
+        </w:tc>
+        <w:tc>
+          <w:tcPr>
+            <w:tcW w:type="dxa" w:w="8352"/>
+          </w:tcPr>
+          <w:p>
+            <w:pPr>
+              <w:spacing w:after="40" w:before="40" w:line="240" w:lineRule="auto"/>
+            </w:pPr>
+            <w:r/>
+            <w:r>
+              <w:rPr>
+                <w:sz w:val="20"/>
+              </w:rPr>
+              <w:t>Geocodifica la dirección y ordena los centros por tiempo de llegada.</w:t>
+            </w:r>
+          </w:p>
+        </w:tc>
+      </w:tr>
+      <w:tr>
+        <w:trPr>
+          <w:cantSplit w:val="true"/>
+        </w:trPr>
+        <w:tc>
+          <w:tcPr>
+            <w:tcW w:type="dxa" w:w="864"/>
+            <w:shd w:val="clear" w:color="auto" w:fill="EAF2FB"/>
+          </w:tcPr>
+          <w:p>
+            <w:pPr>
+              <w:spacing w:after="40" w:before="40" w:line="240" w:lineRule="auto"/>
+            </w:pPr>
+            <w:r/>
+            <w:r>
+              <w:rPr>
+                <w:sz w:val="20"/>
+              </w:rPr>
+              <w:t>6</w:t>
+            </w:r>
+          </w:p>
+        </w:tc>
+        <w:tc>
+          <w:tcPr>
+            <w:tcW w:type="dxa" w:w="4320"/>
+            <w:shd w:val="clear" w:color="auto" w:fill="EAF2FB"/>
+          </w:tcPr>
+          <w:p>
+            <w:pPr>
+              <w:spacing w:after="40" w:before="40" w:line="240" w:lineRule="auto"/>
+            </w:pPr>
+            <w:r/>
+            <w:r>
+              <w:rPr>
+                <w:sz w:val="20"/>
+              </w:rPr>
+              <w:t>Confirma la remisión (HU04)</w:t>
+            </w:r>
+          </w:p>
+        </w:tc>
+        <w:tc>
+          <w:tcPr>
+            <w:tcW w:type="dxa" w:w="8352"/>
+            <w:shd w:val="clear" w:color="auto" w:fill="EAF2FB"/>
+          </w:tcPr>
+          <w:p>
+            <w:pPr>
+              <w:spacing w:after="40" w:before="40" w:line="240" w:lineRule="auto"/>
+            </w:pPr>
+            <w:r/>
+            <w:r>
+              <w:rPr>
+                <w:sz w:val="20"/>
+              </w:rPr>
+              <w:t>Publica un evento y avisa al centro por llamada, SMS o correo, con reintentos.</w:t>
+            </w:r>
+          </w:p>
+        </w:tc>
+      </w:tr>
+      <w:tr>
+        <w:trPr>
+          <w:cantSplit w:val="true"/>
+        </w:trPr>
+        <w:tc>
+          <w:tcPr>
+            <w:tcW w:type="dxa" w:w="864"/>
+          </w:tcPr>
+          <w:p>
+            <w:pPr>
+              <w:spacing w:after="40" w:before="40" w:line="240" w:lineRule="auto"/>
+            </w:pPr>
+            <w:r/>
+            <w:r>
+              <w:rPr>
+                <w:sz w:val="20"/>
+              </w:rPr>
+              <w:t>7</w:t>
+            </w:r>
+          </w:p>
+        </w:tc>
+        <w:tc>
+          <w:tcPr>
+            <w:tcW w:type="dxa" w:w="4320"/>
+          </w:tcPr>
+          <w:p>
+            <w:pPr>
+              <w:spacing w:after="40" w:before="40" w:line="240" w:lineRule="auto"/>
+            </w:pPr>
+            <w:r/>
+            <w:r>
+              <w:rPr>
+                <w:sz w:val="20"/>
+              </w:rPr>
+              <w:t>Cierra el caso</w:t>
+            </w:r>
+          </w:p>
+        </w:tc>
+        <w:tc>
+          <w:tcPr>
+            <w:tcW w:type="dxa" w:w="8352"/>
+          </w:tcPr>
+          <w:p>
+            <w:pPr>
+              <w:spacing w:after="40" w:before="40" w:line="240" w:lineRule="auto"/>
+            </w:pPr>
+            <w:r/>
+            <w:r>
+              <w:rPr>
+                <w:sz w:val="20"/>
+              </w:rPr>
+              <w:t>Guarda el resultado de la atención para indicadores y auditoría.</w:t>
+            </w:r>
+          </w:p>
+        </w:tc>
+      </w:tr>
+    </w:tbl>
+    <w:p/>
     <w:p>
       <w:pPr>
         <w:sectPr>
@@ -4507,7 +4789,7 @@
       <w:r>
         <w:drawing>
           <wp:inline xmlns:a="http://schemas.openxmlformats.org/drawingml/2006/main" xmlns:pic="http://schemas.openxmlformats.org/drawingml/2006/picture">
-            <wp:extent cx="5943600" cy="6201358"/>
+            <wp:extent cx="5943600" cy="2842921"/>
             <wp:docPr id="9" name="Picture 9"/>
             <wp:cNvGraphicFramePr>
               <a:graphicFrameLocks noChangeAspect="1"/>
@@ -4528,7 +4810,7 @@
                   <pic:spPr>
                     <a:xfrm>
                       <a:off x="0" y="0"/>
-                      <a:ext cx="5943600" cy="6201358"/>
+                      <a:ext cx="5943600" cy="2842921"/>
                     </a:xfrm>
                     <a:prstGeom prst="rect"/>
                   </pic:spPr>
@@ -7092,7 +7374,7 @@
         <w:t xml:space="preserve">Costo total: </w:t>
       </w:r>
       <w:r>
-        <w:t>AWS es cerca de 35% más económico en precios de lista, sobre todo por API Gateway, mensajería y logs. Con reservas a 3 años, Azure baja a $6.245 al mes (21% de ahorro) y reduce la brecha.</w:t>
+        <w:t>AWS es cerca de 35% más económico en precios de lista, sobre todo por API Gateway, mensajería y logs. Con reservas a 3 años, Azure baja a $20.443.500 COP al mes (21% de ahorro) y reduce la brecha.</w:t>
       </w:r>
     </w:p>
     <w:p>
@@ -7172,7 +7454,7 @@
         <w:rPr>
           <w:i w:val="0"/>
         </w:rPr>
-        <w:t>La estimación detallada está en el archivo costos/Estimacion_Costos_Medical_Health.xlsx, con fórmulas que dependen de una hoja de supuestos editable y referencias a las páginas oficiales de precios. Los precios son de lista en USD, consultados en octubre de 2026.</w:t>
+        <w:t>La estimación detallada está en el archivo costos/Estimacion_Costos_Medical_Health.xlsx, con fórmulas que dependen de una hoja de supuestos editable y referencias a las páginas oficiales de precios. Los precios de lista se consultaron en dólares en octubre de 2026 y se convirtieron a pesos colombianos con la TRM de $3.273,49 COP por dólar (Banco de la República, vigente del 3 al 5 de octubre de 2026).</w:t>
       </w:r>
     </w:p>
     <w:tbl>
@@ -7184,9 +7466,9 @@
         <w:tblLook w:firstColumn="1" w:firstRow="1" w:lastColumn="0" w:lastRow="0" w:noHBand="0" w:noVBand="1" w:val="04A0"/>
       </w:tblPr>
       <w:tblGrid>
-        <w:gridCol w:w="4608"/>
-        <w:gridCol w:w="2304"/>
-        <w:gridCol w:w="2304"/>
+        <w:gridCol w:w="4320"/>
+        <w:gridCol w:w="2520"/>
+        <w:gridCol w:w="2520"/>
       </w:tblGrid>
       <w:tr>
         <w:trPr>
@@ -7195,7 +7477,7 @@
         </w:trPr>
         <w:tc>
           <w:tcPr>
-            <w:tcW w:type="dxa" w:w="4608"/>
+            <w:tcW w:type="dxa" w:w="4320"/>
             <w:shd w:val="clear" w:color="auto" w:fill="0B3C5D"/>
           </w:tcPr>
           <w:p>
@@ -7215,7 +7497,7 @@
         </w:tc>
         <w:tc>
           <w:tcPr>
-            <w:tcW w:type="dxa" w:w="2304"/>
+            <w:tcW w:type="dxa" w:w="2520"/>
             <w:shd w:val="clear" w:color="auto" w:fill="0B3C5D"/>
           </w:tcPr>
           <w:p>
@@ -7229,13 +7511,13 @@
                 <w:color w:val="FFFFFF"/>
                 <w:sz w:val="19"/>
               </w:rPr>
-              <w:t>Azure (USD/mes)</w:t>
-            </w:r>
-          </w:p>
-        </w:tc>
-        <w:tc>
-          <w:tcPr>
-            <w:tcW w:type="dxa" w:w="2304"/>
+              <w:t>Azure (COP/mes)</w:t>
+            </w:r>
+          </w:p>
+        </w:tc>
+        <w:tc>
+          <w:tcPr>
+            <w:tcW w:type="dxa" w:w="2520"/>
             <w:shd w:val="clear" w:color="auto" w:fill="0B3C5D"/>
           </w:tcPr>
           <w:p>
@@ -7249,7 +7531,7 @@
                 <w:color w:val="FFFFFF"/>
                 <w:sz w:val="19"/>
               </w:rPr>
-              <w:t>AWS (USD/mes)</w:t>
+              <w:t>AWS (COP/mes)</w:t>
             </w:r>
           </w:p>
         </w:tc>
@@ -7260,7 +7542,7 @@
         </w:trPr>
         <w:tc>
           <w:tcPr>
-            <w:tcW w:type="dxa" w:w="4608"/>
+            <w:tcW w:type="dxa" w:w="4320"/>
           </w:tcPr>
           <w:p>
             <w:pPr>
@@ -7277,7 +7559,7 @@
         </w:tc>
         <w:tc>
           <w:tcPr>
-            <w:tcW w:type="dxa" w:w="2304"/>
+            <w:tcW w:type="dxa" w:w="2520"/>
           </w:tcPr>
           <w:p>
             <w:pPr>
@@ -7288,13 +7570,13 @@
               <w:rPr>
                 <w:sz w:val="19"/>
               </w:rPr>
-              <w:t>$1.195,88</w:t>
-            </w:r>
-          </w:p>
-        </w:tc>
-        <w:tc>
-          <w:tcPr>
-            <w:tcW w:type="dxa" w:w="2304"/>
+              <w:t>$3.914.688</w:t>
+            </w:r>
+          </w:p>
+        </w:tc>
+        <w:tc>
+          <w:tcPr>
+            <w:tcW w:type="dxa" w:w="2520"/>
           </w:tcPr>
           <w:p>
             <w:pPr>
@@ -7305,7 +7587,7 @@
               <w:rPr>
                 <w:sz w:val="19"/>
               </w:rPr>
-              <w:t>$1.058,40</w:t>
+              <w:t>$3.464.662</w:t>
             </w:r>
           </w:p>
         </w:tc>
@@ -7316,7 +7598,7 @@
         </w:trPr>
         <w:tc>
           <w:tcPr>
-            <w:tcW w:type="dxa" w:w="4608"/>
+            <w:tcW w:type="dxa" w:w="4320"/>
             <w:shd w:val="clear" w:color="auto" w:fill="EAF2FB"/>
           </w:tcPr>
           <w:p>
@@ -7334,7 +7616,7 @@
         </w:tc>
         <w:tc>
           <w:tcPr>
-            <w:tcW w:type="dxa" w:w="2304"/>
+            <w:tcW w:type="dxa" w:w="2520"/>
             <w:shd w:val="clear" w:color="auto" w:fill="EAF2FB"/>
           </w:tcPr>
           <w:p>
@@ -7346,13 +7628,13 @@
               <w:rPr>
                 <w:sz w:val="19"/>
               </w:rPr>
-              <w:t>$1.510,12</w:t>
-            </w:r>
-          </w:p>
-        </w:tc>
-        <w:tc>
-          <w:tcPr>
-            <w:tcW w:type="dxa" w:w="2304"/>
+              <w:t>$4.943.347</w:t>
+            </w:r>
+          </w:p>
+        </w:tc>
+        <w:tc>
+          <w:tcPr>
+            <w:tcW w:type="dxa" w:w="2520"/>
             <w:shd w:val="clear" w:color="auto" w:fill="EAF2FB"/>
           </w:tcPr>
           <w:p>
@@ -7364,7 +7646,7 @@
               <w:rPr>
                 <w:sz w:val="19"/>
               </w:rPr>
-              <w:t>$1.455,33</w:t>
+              <w:t>$4.764.002</w:t>
             </w:r>
           </w:p>
         </w:tc>
@@ -7375,7 +7657,7 @@
         </w:trPr>
         <w:tc>
           <w:tcPr>
-            <w:tcW w:type="dxa" w:w="4608"/>
+            <w:tcW w:type="dxa" w:w="4320"/>
           </w:tcPr>
           <w:p>
             <w:pPr>
@@ -7392,7 +7674,7 @@
         </w:tc>
         <w:tc>
           <w:tcPr>
-            <w:tcW w:type="dxa" w:w="2304"/>
+            <w:tcW w:type="dxa" w:w="2520"/>
           </w:tcPr>
           <w:p>
             <w:pPr>
@@ -7403,13 +7685,13 @@
               <w:rPr>
                 <w:sz w:val="19"/>
               </w:rPr>
-              <w:t>$1.886,34</w:t>
-            </w:r>
-          </w:p>
-        </w:tc>
-        <w:tc>
-          <w:tcPr>
-            <w:tcW w:type="dxa" w:w="2304"/>
+              <w:t>$6.174.928</w:t>
+            </w:r>
+          </w:p>
+        </w:tc>
+        <w:tc>
+          <w:tcPr>
+            <w:tcW w:type="dxa" w:w="2520"/>
           </w:tcPr>
           <w:p>
             <w:pPr>
@@ -7420,7 +7702,7 @@
               <w:rPr>
                 <w:sz w:val="19"/>
               </w:rPr>
-              <w:t>$331,01</w:t>
+              <w:t>$1.083.558</w:t>
             </w:r>
           </w:p>
         </w:tc>
@@ -7431,7 +7713,7 @@
         </w:trPr>
         <w:tc>
           <w:tcPr>
-            <w:tcW w:type="dxa" w:w="4608"/>
+            <w:tcW w:type="dxa" w:w="4320"/>
             <w:shd w:val="clear" w:color="auto" w:fill="EAF2FB"/>
           </w:tcPr>
           <w:p>
@@ -7449,7 +7731,7 @@
         </w:tc>
         <w:tc>
           <w:tcPr>
-            <w:tcW w:type="dxa" w:w="2304"/>
+            <w:tcW w:type="dxa" w:w="2520"/>
             <w:shd w:val="clear" w:color="auto" w:fill="EAF2FB"/>
           </w:tcPr>
           <w:p>
@@ -7461,13 +7743,13 @@
               <w:rPr>
                 <w:sz w:val="19"/>
               </w:rPr>
-              <w:t>$197,86</w:t>
-            </w:r>
-          </w:p>
-        </w:tc>
-        <w:tc>
-          <w:tcPr>
-            <w:tcW w:type="dxa" w:w="2304"/>
+              <w:t>$647.703</w:t>
+            </w:r>
+          </w:p>
+        </w:tc>
+        <w:tc>
+          <w:tcPr>
+            <w:tcW w:type="dxa" w:w="2520"/>
             <w:shd w:val="clear" w:color="auto" w:fill="EAF2FB"/>
           </w:tcPr>
           <w:p>
@@ -7479,7 +7761,7 @@
               <w:rPr>
                 <w:sz w:val="19"/>
               </w:rPr>
-              <w:t>$82,94</w:t>
+              <w:t>$271.503</w:t>
             </w:r>
           </w:p>
         </w:tc>
@@ -7490,7 +7772,7 @@
         </w:trPr>
         <w:tc>
           <w:tcPr>
-            <w:tcW w:type="dxa" w:w="4608"/>
+            <w:tcW w:type="dxa" w:w="4320"/>
           </w:tcPr>
           <w:p>
             <w:pPr>
@@ -7507,7 +7789,7 @@
         </w:tc>
         <w:tc>
           <w:tcPr>
-            <w:tcW w:type="dxa" w:w="2304"/>
+            <w:tcW w:type="dxa" w:w="2520"/>
           </w:tcPr>
           <w:p>
             <w:pPr>
@@ -7518,13 +7800,13 @@
               <w:rPr>
                 <w:sz w:val="19"/>
               </w:rPr>
-              <w:t>$636,20</w:t>
-            </w:r>
-          </w:p>
-        </w:tc>
-        <w:tc>
-          <w:tcPr>
-            <w:tcW w:type="dxa" w:w="2304"/>
+              <w:t>$2.082.593</w:t>
+            </w:r>
+          </w:p>
+        </w:tc>
+        <w:tc>
+          <w:tcPr>
+            <w:tcW w:type="dxa" w:w="2520"/>
           </w:tcPr>
           <w:p>
             <w:pPr>
@@ -7535,7 +7817,7 @@
               <w:rPr>
                 <w:sz w:val="19"/>
               </w:rPr>
-              <w:t>$313,00</w:t>
+              <w:t>$1.024.602</w:t>
             </w:r>
           </w:p>
         </w:tc>
@@ -7546,7 +7828,7 @@
         </w:trPr>
         <w:tc>
           <w:tcPr>
-            <w:tcW w:type="dxa" w:w="4608"/>
+            <w:tcW w:type="dxa" w:w="4320"/>
             <w:shd w:val="clear" w:color="auto" w:fill="EAF2FB"/>
           </w:tcPr>
           <w:p>
@@ -7564,7 +7846,7 @@
         </w:tc>
         <w:tc>
           <w:tcPr>
-            <w:tcW w:type="dxa" w:w="2304"/>
+            <w:tcW w:type="dxa" w:w="2520"/>
             <w:shd w:val="clear" w:color="auto" w:fill="EAF2FB"/>
           </w:tcPr>
           <w:p>
@@ -7576,13 +7858,13 @@
               <w:rPr>
                 <w:sz w:val="19"/>
               </w:rPr>
-              <w:t>$2.018,28</w:t>
-            </w:r>
-          </w:p>
-        </w:tc>
-        <w:tc>
-          <w:tcPr>
-            <w:tcW w:type="dxa" w:w="2304"/>
+              <w:t>$6.606.803</w:t>
+            </w:r>
+          </w:p>
+        </w:tc>
+        <w:tc>
+          <w:tcPr>
+            <w:tcW w:type="dxa" w:w="2520"/>
             <w:shd w:val="clear" w:color="auto" w:fill="EAF2FB"/>
           </w:tcPr>
           <w:p>
@@ -7594,7 +7876,7 @@
               <w:rPr>
                 <w:sz w:val="19"/>
               </w:rPr>
-              <w:t>$1.570,19</w:t>
+              <w:t>$5.139.986</w:t>
             </w:r>
           </w:p>
         </w:tc>
@@ -7605,7 +7887,7 @@
         </w:trPr>
         <w:tc>
           <w:tcPr>
-            <w:tcW w:type="dxa" w:w="4608"/>
+            <w:tcW w:type="dxa" w:w="4320"/>
           </w:tcPr>
           <w:p>
             <w:pPr>
@@ -7622,7 +7904,7 @@
         </w:tc>
         <w:tc>
           <w:tcPr>
-            <w:tcW w:type="dxa" w:w="2304"/>
+            <w:tcW w:type="dxa" w:w="2520"/>
           </w:tcPr>
           <w:p>
             <w:pPr>
@@ -7633,13 +7915,13 @@
               <w:rPr>
                 <w:sz w:val="19"/>
               </w:rPr>
-              <w:t>$477,87</w:t>
-            </w:r>
-          </w:p>
-        </w:tc>
-        <w:tc>
-          <w:tcPr>
-            <w:tcW w:type="dxa" w:w="2304"/>
+              <w:t>$1.564.310</w:t>
+            </w:r>
+          </w:p>
+        </w:tc>
+        <w:tc>
+          <w:tcPr>
+            <w:tcW w:type="dxa" w:w="2520"/>
           </w:tcPr>
           <w:p>
             <w:pPr>
@@ -7650,7 +7932,7 @@
               <w:rPr>
                 <w:sz w:val="19"/>
               </w:rPr>
-              <w:t>$310,09</w:t>
+              <w:t>$1.015.077</w:t>
             </w:r>
           </w:p>
         </w:tc>
@@ -7661,7 +7943,7 @@
         </w:trPr>
         <w:tc>
           <w:tcPr>
-            <w:tcW w:type="dxa" w:w="4608"/>
+            <w:tcW w:type="dxa" w:w="4320"/>
             <w:shd w:val="clear" w:color="auto" w:fill="EAF2FB"/>
           </w:tcPr>
           <w:p>
@@ -7673,13 +7955,13 @@
               <w:rPr>
                 <w:sz w:val="19"/>
               </w:rPr>
-              <w:t>TOTAL</w:t>
-            </w:r>
-          </w:p>
-        </w:tc>
-        <w:tc>
-          <w:tcPr>
-            <w:tcW w:type="dxa" w:w="2304"/>
+              <w:t>TOTAL MENSUAL</w:t>
+            </w:r>
+          </w:p>
+        </w:tc>
+        <w:tc>
+          <w:tcPr>
+            <w:tcW w:type="dxa" w:w="2520"/>
             <w:shd w:val="clear" w:color="auto" w:fill="EAF2FB"/>
           </w:tcPr>
           <w:p>
@@ -7691,13 +7973,13 @@
               <w:rPr>
                 <w:sz w:val="19"/>
               </w:rPr>
-              <w:t>$7.922,55</w:t>
-            </w:r>
-          </w:p>
-        </w:tc>
-        <w:tc>
-          <w:tcPr>
-            <w:tcW w:type="dxa" w:w="2304"/>
+              <w:t>$25.934.373</w:t>
+            </w:r>
+          </w:p>
+        </w:tc>
+        <w:tc>
+          <w:tcPr>
+            <w:tcW w:type="dxa" w:w="2520"/>
             <w:shd w:val="clear" w:color="auto" w:fill="EAF2FB"/>
           </w:tcPr>
           <w:p>
@@ -7709,7 +7991,63 @@
               <w:rPr>
                 <w:sz w:val="19"/>
               </w:rPr>
-              <w:t>$5.120,95</w:t>
+              <w:t>$16.763.389</w:t>
+            </w:r>
+          </w:p>
+        </w:tc>
+      </w:tr>
+      <w:tr>
+        <w:trPr>
+          <w:cantSplit w:val="true"/>
+        </w:trPr>
+        <w:tc>
+          <w:tcPr>
+            <w:tcW w:type="dxa" w:w="4320"/>
+          </w:tcPr>
+          <w:p>
+            <w:pPr>
+              <w:spacing w:after="40" w:before="40" w:line="240" w:lineRule="auto"/>
+            </w:pPr>
+            <w:r/>
+            <w:r>
+              <w:rPr>
+                <w:sz w:val="19"/>
+              </w:rPr>
+              <w:t>TOTAL ANUAL</w:t>
+            </w:r>
+          </w:p>
+        </w:tc>
+        <w:tc>
+          <w:tcPr>
+            <w:tcW w:type="dxa" w:w="2520"/>
+          </w:tcPr>
+          <w:p>
+            <w:pPr>
+              <w:spacing w:after="40" w:before="40" w:line="240" w:lineRule="auto"/>
+            </w:pPr>
+            <w:r/>
+            <w:r>
+              <w:rPr>
+                <w:sz w:val="19"/>
+              </w:rPr>
+              <w:t>$311.212.472</w:t>
+            </w:r>
+          </w:p>
+        </w:tc>
+        <w:tc>
+          <w:tcPr>
+            <w:tcW w:type="dxa" w:w="2520"/>
+          </w:tcPr>
+          <w:p>
+            <w:pPr>
+              <w:spacing w:after="40" w:before="40" w:line="240" w:lineRule="auto"/>
+            </w:pPr>
+            <w:r/>
+            <w:r>
+              <w:rPr>
+                <w:sz w:val="19"/>
+              </w:rPr>
+              <w:t>$201.160.669</w:t>
             </w:r>
           </w:p>
         </w:tc>
@@ -7733,10 +8071,10 @@
         <w:tblLook w:firstColumn="1" w:firstRow="1" w:lastColumn="0" w:lastRow="0" w:noHBand="0" w:noVBand="1" w:val="04A0"/>
       </w:tblPr>
       <w:tblGrid>
-        <w:gridCol w:w="4031"/>
-        <w:gridCol w:w="1728"/>
-        <w:gridCol w:w="1728"/>
+        <w:gridCol w:w="3600"/>
         <w:gridCol w:w="1872"/>
+        <w:gridCol w:w="1872"/>
+        <w:gridCol w:w="2015"/>
       </w:tblGrid>
       <w:tr>
         <w:trPr>
@@ -7745,7 +8083,7 @@
         </w:trPr>
         <w:tc>
           <w:tcPr>
-            <w:tcW w:type="dxa" w:w="4032"/>
+            <w:tcW w:type="dxa" w:w="3600"/>
             <w:shd w:val="clear" w:color="auto" w:fill="0B3C5D"/>
           </w:tcPr>
           <w:p>
@@ -7759,13 +8097,13 @@
                 <w:color w:val="FFFFFF"/>
                 <w:sz w:val="18"/>
               </w:rPr>
-              <w:t>Concepto</w:t>
-            </w:r>
-          </w:p>
-        </w:tc>
-        <w:tc>
-          <w:tcPr>
-            <w:tcW w:type="dxa" w:w="1728"/>
+              <w:t>Concepto (COP/mes)</w:t>
+            </w:r>
+          </w:p>
+        </w:tc>
+        <w:tc>
+          <w:tcPr>
+            <w:tcW w:type="dxa" w:w="1872"/>
             <w:shd w:val="clear" w:color="auto" w:fill="0B3C5D"/>
           </w:tcPr>
           <w:p>
@@ -7785,7 +8123,7 @@
         </w:tc>
         <w:tc>
           <w:tcPr>
-            <w:tcW w:type="dxa" w:w="1728"/>
+            <w:tcW w:type="dxa" w:w="1872"/>
             <w:shd w:val="clear" w:color="auto" w:fill="0B3C5D"/>
           </w:tcPr>
           <w:p>
@@ -7799,13 +8137,13 @@
                 <w:color w:val="FFFFFF"/>
                 <w:sz w:val="18"/>
               </w:rPr>
-              <w:t>Reserva 1 año</w:t>
-            </w:r>
-          </w:p>
-        </w:tc>
-        <w:tc>
-          <w:tcPr>
-            <w:tcW w:type="dxa" w:w="1872"/>
+              <w:t>Reservas 1 año</w:t>
+            </w:r>
+          </w:p>
+        </w:tc>
+        <w:tc>
+          <w:tcPr>
+            <w:tcW w:type="dxa" w:w="2016"/>
             <w:shd w:val="clear" w:color="auto" w:fill="0B3C5D"/>
           </w:tcPr>
           <w:p>
@@ -7819,7 +8157,7 @@
                 <w:color w:val="FFFFFF"/>
                 <w:sz w:val="18"/>
               </w:rPr>
-              <w:t>Reserva 3 años</w:t>
+              <w:t>Reservas 3 años</w:t>
             </w:r>
           </w:p>
         </w:tc>
@@ -7830,7 +8168,7 @@
         </w:trPr>
         <w:tc>
           <w:tcPr>
-            <w:tcW w:type="dxa" w:w="4032"/>
+            <w:tcW w:type="dxa" w:w="3600"/>
           </w:tcPr>
           <w:p>
             <w:pPr>
@@ -7847,7 +8185,7 @@
         </w:tc>
         <w:tc>
           <w:tcPr>
-            <w:tcW w:type="dxa" w:w="1728"/>
+            <w:tcW w:type="dxa" w:w="1872"/>
           </w:tcPr>
           <w:p>
             <w:pPr>
@@ -7858,13 +8196,13 @@
               <w:rPr>
                 <w:sz w:val="18"/>
               </w:rPr>
-              <w:t>$840,96</w:t>
-            </w:r>
-          </w:p>
-        </w:tc>
-        <w:tc>
-          <w:tcPr>
-            <w:tcW w:type="dxa" w:w="1728"/>
+              <w:t>$2.752.874</w:t>
+            </w:r>
+          </w:p>
+        </w:tc>
+        <w:tc>
+          <w:tcPr>
+            <w:tcW w:type="dxa" w:w="1872"/>
           </w:tcPr>
           <w:p>
             <w:pPr>
@@ -7875,13 +8213,13 @@
               <w:rPr>
                 <w:sz w:val="18"/>
               </w:rPr>
-              <w:t>$519,00</w:t>
-            </w:r>
-          </w:p>
-        </w:tc>
-        <w:tc>
-          <w:tcPr>
-            <w:tcW w:type="dxa" w:w="1872"/>
+              <w:t>$1.698.941</w:t>
+            </w:r>
+          </w:p>
+        </w:tc>
+        <w:tc>
+          <w:tcPr>
+            <w:tcW w:type="dxa" w:w="2016"/>
           </w:tcPr>
           <w:p>
             <w:pPr>
@@ -7892,7 +8230,7 @@
               <w:rPr>
                 <w:sz w:val="18"/>
               </w:rPr>
-              <w:t>$332,17</w:t>
+              <w:t>$1.087.344</w:t>
             </w:r>
           </w:p>
         </w:tc>
@@ -7903,7 +8241,7 @@
         </w:trPr>
         <w:tc>
           <w:tcPr>
-            <w:tcW w:type="dxa" w:w="4032"/>
+            <w:tcW w:type="dxa" w:w="3600"/>
             <w:shd w:val="clear" w:color="auto" w:fill="EAF2FB"/>
           </w:tcPr>
           <w:p>
@@ -7916,42 +8254,6 @@
                 <w:sz w:val="18"/>
               </w:rPr>
               <w:t>PostgreSQL (primario, standby y réplica)</w:t>
-            </w:r>
-          </w:p>
-        </w:tc>
-        <w:tc>
-          <w:tcPr>
-            <w:tcW w:type="dxa" w:w="1728"/>
-            <w:shd w:val="clear" w:color="auto" w:fill="EAF2FB"/>
-          </w:tcPr>
-          <w:p>
-            <w:pPr>
-              <w:spacing w:after="40" w:before="40" w:line="240" w:lineRule="auto"/>
-            </w:pPr>
-            <w:r/>
-            <w:r>
-              <w:rPr>
-                <w:sz w:val="18"/>
-              </w:rPr>
-              <w:t>$779,64</w:t>
-            </w:r>
-          </w:p>
-        </w:tc>
-        <w:tc>
-          <w:tcPr>
-            <w:tcW w:type="dxa" w:w="1728"/>
-            <w:shd w:val="clear" w:color="auto" w:fill="EAF2FB"/>
-          </w:tcPr>
-          <w:p>
-            <w:pPr>
-              <w:spacing w:after="40" w:before="40" w:line="240" w:lineRule="auto"/>
-            </w:pPr>
-            <w:r/>
-            <w:r>
-              <w:rPr>
-                <w:sz w:val="18"/>
-              </w:rPr>
-              <w:t>$468,00</w:t>
             </w:r>
           </w:p>
         </w:tc>
@@ -7969,7 +8271,43 @@
               <w:rPr>
                 <w:sz w:val="18"/>
               </w:rPr>
-              <w:t>$312,00</w:t>
+              <w:t>$2.552.144</w:t>
+            </w:r>
+          </w:p>
+        </w:tc>
+        <w:tc>
+          <w:tcPr>
+            <w:tcW w:type="dxa" w:w="1872"/>
+            <w:shd w:val="clear" w:color="auto" w:fill="EAF2FB"/>
+          </w:tcPr>
+          <w:p>
+            <w:pPr>
+              <w:spacing w:after="40" w:before="40" w:line="240" w:lineRule="auto"/>
+            </w:pPr>
+            <w:r/>
+            <w:r>
+              <w:rPr>
+                <w:sz w:val="18"/>
+              </w:rPr>
+              <w:t>$1.531.993</w:t>
+            </w:r>
+          </w:p>
+        </w:tc>
+        <w:tc>
+          <w:tcPr>
+            <w:tcW w:type="dxa" w:w="2016"/>
+            <w:shd w:val="clear" w:color="auto" w:fill="EAF2FB"/>
+          </w:tcPr>
+          <w:p>
+            <w:pPr>
+              <w:spacing w:after="40" w:before="40" w:line="240" w:lineRule="auto"/>
+            </w:pPr>
+            <w:r/>
+            <w:r>
+              <w:rPr>
+                <w:sz w:val="18"/>
+              </w:rPr>
+              <w:t>$1.021.329</w:t>
             </w:r>
           </w:p>
         </w:tc>
@@ -7980,7 +8318,7 @@
         </w:trPr>
         <w:tc>
           <w:tcPr>
-            <w:tcW w:type="dxa" w:w="4032"/>
+            <w:tcW w:type="dxa" w:w="3600"/>
           </w:tcPr>
           <w:p>
             <w:pPr>
@@ -7997,7 +8335,7 @@
         </w:tc>
         <w:tc>
           <w:tcPr>
-            <w:tcW w:type="dxa" w:w="1728"/>
+            <w:tcW w:type="dxa" w:w="1872"/>
           </w:tcPr>
           <w:p>
             <w:pPr>
@@ -8008,13 +8346,13 @@
               <w:rPr>
                 <w:sz w:val="18"/>
               </w:rPr>
-              <w:t>$405,15</w:t>
-            </w:r>
-          </w:p>
-        </w:tc>
-        <w:tc>
-          <w:tcPr>
-            <w:tcW w:type="dxa" w:w="1728"/>
+              <w:t>$1.326.254</w:t>
+            </w:r>
+          </w:p>
+        </w:tc>
+        <w:tc>
+          <w:tcPr>
+            <w:tcW w:type="dxa" w:w="1872"/>
           </w:tcPr>
           <w:p>
             <w:pPr>
@@ -8025,13 +8363,13 @@
               <w:rPr>
                 <w:sz w:val="18"/>
               </w:rPr>
-              <w:t>$263,35</w:t>
-            </w:r>
-          </w:p>
-        </w:tc>
-        <w:tc>
-          <w:tcPr>
-            <w:tcW w:type="dxa" w:w="1872"/>
+              <w:t>$862.065</w:t>
+            </w:r>
+          </w:p>
+        </w:tc>
+        <w:tc>
+          <w:tcPr>
+            <w:tcW w:type="dxa" w:w="2016"/>
           </w:tcPr>
           <w:p>
             <w:pPr>
@@ -8042,7 +8380,7 @@
               <w:rPr>
                 <w:sz w:val="18"/>
               </w:rPr>
-              <w:t>$182,32</w:t>
+              <w:t>$596.815</w:t>
             </w:r>
           </w:p>
         </w:tc>
@@ -8053,7 +8391,7 @@
         </w:trPr>
         <w:tc>
           <w:tcPr>
-            <w:tcW w:type="dxa" w:w="4032"/>
+            <w:tcW w:type="dxa" w:w="3600"/>
             <w:shd w:val="clear" w:color="auto" w:fill="EAF2FB"/>
           </w:tcPr>
           <w:p>
@@ -8066,42 +8404,6 @@
                 <w:sz w:val="18"/>
               </w:rPr>
               <w:t>Log Analytics</w:t>
-            </w:r>
-          </w:p>
-        </w:tc>
-        <w:tc>
-          <w:tcPr>
-            <w:tcW w:type="dxa" w:w="1728"/>
-            <w:shd w:val="clear" w:color="auto" w:fill="EAF2FB"/>
-          </w:tcPr>
-          <w:p>
-            <w:pPr>
-              <w:spacing w:after="40" w:before="40" w:line="240" w:lineRule="auto"/>
-            </w:pPr>
-            <w:r/>
-            <w:r>
-              <w:rPr>
-                <w:sz w:val="18"/>
-              </w:rPr>
-              <w:t>$538,20</w:t>
-            </w:r>
-          </w:p>
-        </w:tc>
-        <w:tc>
-          <w:tcPr>
-            <w:tcW w:type="dxa" w:w="1728"/>
-            <w:shd w:val="clear" w:color="auto" w:fill="EAF2FB"/>
-          </w:tcPr>
-          <w:p>
-            <w:pPr>
-              <w:spacing w:after="40" w:before="40" w:line="240" w:lineRule="auto"/>
-            </w:pPr>
-            <w:r/>
-            <w:r>
-              <w:rPr>
-                <w:sz w:val="18"/>
-              </w:rPr>
-              <w:t>$322,92</w:t>
             </w:r>
           </w:p>
         </w:tc>
@@ -8119,7 +8421,43 @@
               <w:rPr>
                 <w:sz w:val="18"/>
               </w:rPr>
-              <w:t>$322,92</w:t>
+              <w:t>$1.761.792</w:t>
+            </w:r>
+          </w:p>
+        </w:tc>
+        <w:tc>
+          <w:tcPr>
+            <w:tcW w:type="dxa" w:w="1872"/>
+            <w:shd w:val="clear" w:color="auto" w:fill="EAF2FB"/>
+          </w:tcPr>
+          <w:p>
+            <w:pPr>
+              <w:spacing w:after="40" w:before="40" w:line="240" w:lineRule="auto"/>
+            </w:pPr>
+            <w:r/>
+            <w:r>
+              <w:rPr>
+                <w:sz w:val="18"/>
+              </w:rPr>
+              <w:t>$1.057.075</w:t>
+            </w:r>
+          </w:p>
+        </w:tc>
+        <w:tc>
+          <w:tcPr>
+            <w:tcW w:type="dxa" w:w="2016"/>
+            <w:shd w:val="clear" w:color="auto" w:fill="EAF2FB"/>
+          </w:tcPr>
+          <w:p>
+            <w:pPr>
+              <w:spacing w:after="40" w:before="40" w:line="240" w:lineRule="auto"/>
+            </w:pPr>
+            <w:r/>
+            <w:r>
+              <w:rPr>
+                <w:sz w:val="18"/>
+              </w:rPr>
+              <w:t>$1.057.075</w:t>
             </w:r>
           </w:p>
         </w:tc>
@@ -8130,7 +8468,7 @@
         </w:trPr>
         <w:tc>
           <w:tcPr>
-            <w:tcW w:type="dxa" w:w="4032"/>
+            <w:tcW w:type="dxa" w:w="3600"/>
           </w:tcPr>
           <w:p>
             <w:pPr>
@@ -8147,7 +8485,7 @@
         </w:tc>
         <w:tc>
           <w:tcPr>
-            <w:tcW w:type="dxa" w:w="1728"/>
+            <w:tcW w:type="dxa" w:w="1872"/>
           </w:tcPr>
           <w:p>
             <w:pPr>
@@ -8158,13 +8496,13 @@
               <w:rPr>
                 <w:sz w:val="18"/>
               </w:rPr>
-              <w:t>$477,87</w:t>
-            </w:r>
-          </w:p>
-        </w:tc>
-        <w:tc>
-          <w:tcPr>
-            <w:tcW w:type="dxa" w:w="1728"/>
+              <w:t>$1.564.310</w:t>
+            </w:r>
+          </w:p>
+        </w:tc>
+        <w:tc>
+          <w:tcPr>
+            <w:tcW w:type="dxa" w:w="1872"/>
           </w:tcPr>
           <w:p>
             <w:pPr>
@@ -8175,13 +8513,13 @@
               <w:rPr>
                 <w:sz w:val="18"/>
               </w:rPr>
-              <w:t>$215,04</w:t>
-            </w:r>
-          </w:p>
-        </w:tc>
-        <w:tc>
-          <w:tcPr>
-            <w:tcW w:type="dxa" w:w="1872"/>
+              <w:t>$703.940</w:t>
+            </w:r>
+          </w:p>
+        </w:tc>
+        <w:tc>
+          <w:tcPr>
+            <w:tcW w:type="dxa" w:w="2016"/>
           </w:tcPr>
           <w:p>
             <w:pPr>
@@ -8192,7 +8530,7 @@
               <w:rPr>
                 <w:sz w:val="18"/>
               </w:rPr>
-              <w:t>$215,04</w:t>
+              <w:t>$703.940</w:t>
             </w:r>
           </w:p>
         </w:tc>
@@ -8203,7 +8541,7 @@
         </w:trPr>
         <w:tc>
           <w:tcPr>
-            <w:tcW w:type="dxa" w:w="4032"/>
+            <w:tcW w:type="dxa" w:w="3600"/>
             <w:shd w:val="clear" w:color="auto" w:fill="EAF2FB"/>
           </w:tcPr>
           <w:p>
@@ -8216,42 +8554,6 @@
                 <w:sz w:val="18"/>
               </w:rPr>
               <w:t>Resto de servicios (sin cambio)</w:t>
-            </w:r>
-          </w:p>
-        </w:tc>
-        <w:tc>
-          <w:tcPr>
-            <w:tcW w:type="dxa" w:w="1728"/>
-            <w:shd w:val="clear" w:color="auto" w:fill="EAF2FB"/>
-          </w:tcPr>
-          <w:p>
-            <w:pPr>
-              <w:spacing w:after="40" w:before="40" w:line="240" w:lineRule="auto"/>
-            </w:pPr>
-            <w:r/>
-            <w:r>
-              <w:rPr>
-                <w:sz w:val="18"/>
-              </w:rPr>
-              <w:t>$4.880,72</w:t>
-            </w:r>
-          </w:p>
-        </w:tc>
-        <w:tc>
-          <w:tcPr>
-            <w:tcW w:type="dxa" w:w="1728"/>
-            <w:shd w:val="clear" w:color="auto" w:fill="EAF2FB"/>
-          </w:tcPr>
-          <w:p>
-            <w:pPr>
-              <w:spacing w:after="40" w:before="40" w:line="240" w:lineRule="auto"/>
-            </w:pPr>
-            <w:r/>
-            <w:r>
-              <w:rPr>
-                <w:sz w:val="18"/>
-              </w:rPr>
-              <w:t>$4.880,72</w:t>
             </w:r>
           </w:p>
         </w:tc>
@@ -8269,7 +8571,43 @@
               <w:rPr>
                 <w:sz w:val="18"/>
               </w:rPr>
-              <w:t>$4.880,72</w:t>
+              <w:t>$15.976.998</w:t>
+            </w:r>
+          </w:p>
+        </w:tc>
+        <w:tc>
+          <w:tcPr>
+            <w:tcW w:type="dxa" w:w="1872"/>
+            <w:shd w:val="clear" w:color="auto" w:fill="EAF2FB"/>
+          </w:tcPr>
+          <w:p>
+            <w:pPr>
+              <w:spacing w:after="40" w:before="40" w:line="240" w:lineRule="auto"/>
+            </w:pPr>
+            <w:r/>
+            <w:r>
+              <w:rPr>
+                <w:sz w:val="18"/>
+              </w:rPr>
+              <w:t>$15.976.998</w:t>
+            </w:r>
+          </w:p>
+        </w:tc>
+        <w:tc>
+          <w:tcPr>
+            <w:tcW w:type="dxa" w:w="2016"/>
+            <w:shd w:val="clear" w:color="auto" w:fill="EAF2FB"/>
+          </w:tcPr>
+          <w:p>
+            <w:pPr>
+              <w:spacing w:after="40" w:before="40" w:line="240" w:lineRule="auto"/>
+            </w:pPr>
+            <w:r/>
+            <w:r>
+              <w:rPr>
+                <w:sz w:val="18"/>
+              </w:rPr>
+              <w:t>$15.976.998</w:t>
             </w:r>
           </w:p>
         </w:tc>
@@ -8280,7 +8618,7 @@
         </w:trPr>
         <w:tc>
           <w:tcPr>
-            <w:tcW w:type="dxa" w:w="4032"/>
+            <w:tcW w:type="dxa" w:w="3600"/>
           </w:tcPr>
           <w:p>
             <w:pPr>
@@ -8297,7 +8635,7 @@
         </w:tc>
         <w:tc>
           <w:tcPr>
-            <w:tcW w:type="dxa" w:w="1728"/>
+            <w:tcW w:type="dxa" w:w="1872"/>
           </w:tcPr>
           <w:p>
             <w:pPr>
@@ -8308,13 +8646,13 @@
               <w:rPr>
                 <w:sz w:val="18"/>
               </w:rPr>
-              <w:t>$7.922,55</w:t>
-            </w:r>
-          </w:p>
-        </w:tc>
-        <w:tc>
-          <w:tcPr>
-            <w:tcW w:type="dxa" w:w="1728"/>
+              <w:t>$25.934.373</w:t>
+            </w:r>
+          </w:p>
+        </w:tc>
+        <w:tc>
+          <w:tcPr>
+            <w:tcW w:type="dxa" w:w="1872"/>
           </w:tcPr>
           <w:p>
             <w:pPr>
@@ -8325,13 +8663,13 @@
               <w:rPr>
                 <w:sz w:val="18"/>
               </w:rPr>
-              <w:t>$6.669,03</w:t>
-            </w:r>
-          </w:p>
-        </w:tc>
-        <w:tc>
-          <w:tcPr>
-            <w:tcW w:type="dxa" w:w="1872"/>
+              <w:t>$21.831.013</w:t>
+            </w:r>
+          </w:p>
+        </w:tc>
+        <w:tc>
+          <w:tcPr>
+            <w:tcW w:type="dxa" w:w="2016"/>
           </w:tcPr>
           <w:p>
             <w:pPr>
@@ -8342,7 +8680,7 @@
               <w:rPr>
                 <w:sz w:val="18"/>
               </w:rPr>
-              <w:t>$6.245,17</w:t>
+              <w:t>$20.443.500</w:t>
             </w:r>
           </w:p>
         </w:tc>
@@ -8354,7 +8692,7 @@
         <w:pStyle w:val="ListBullet"/>
       </w:pPr>
       <w:r>
-        <w:t>Con compromisos a 1 año el costo mensual baja a $6.669 (16% de ahorro) y a 3 años a $6.245 (21%).</w:t>
+        <w:t>Con reservas a 1 año el costo mensual baja a $21.831.013 COP (16% de ahorro) y a 3 años a $20.443.500 COP (21%).</w:t>
       </w:r>
     </w:p>
     <w:p>
@@ -8362,7 +8700,7 @@
         <w:pStyle w:val="ListBullet"/>
       </w:pPr>
       <w:r>
-        <w:t>Costo por enfermera al mes con optimización a 1 año: aproximadamente $27.</w:t>
+        <w:t>Costo por enfermera al mes con reservas a 1 año: aproximadamente $87.324 COP.</w:t>
       </w:r>
     </w:p>
     <w:p>
@@ -8411,44 +8749,1078 @@
       </w:r>
     </w:p>
     <w:p>
-      <w:pPr>
-        <w:jc w:val="center"/>
-      </w:pPr>
       <w:r>
-        <w:drawing>
-          <wp:inline xmlns:a="http://schemas.openxmlformats.org/drawingml/2006/main" xmlns:pic="http://schemas.openxmlformats.org/drawingml/2006/picture">
-            <wp:extent cx="5943600" cy="4397051"/>
-            <wp:docPr id="10" name="Picture 10"/>
-            <wp:cNvGraphicFramePr>
-              <a:graphicFrameLocks noChangeAspect="1"/>
-            </wp:cNvGraphicFramePr>
-            <a:graphic>
-              <a:graphicData uri="http://schemas.openxmlformats.org/drawingml/2006/picture">
-                <pic:pic>
-                  <pic:nvPicPr>
-                    <pic:cNvPr id="0" name="07-cronograma.png"/>
-                    <pic:cNvPicPr/>
-                  </pic:nvPicPr>
-                  <pic:blipFill>
-                    <a:blip r:embed="rId19"/>
-                    <a:stretch>
-                      <a:fillRect/>
-                    </a:stretch>
-                  </pic:blipFill>
-                  <pic:spPr>
-                    <a:xfrm>
-                      <a:off x="0" y="0"/>
-                      <a:ext cx="5943600" cy="4397051"/>
-                    </a:xfrm>
-                    <a:prstGeom prst="rect"/>
-                  </pic:spPr>
-                </pic:pic>
-              </a:graphicData>
-            </a:graphic>
-          </wp:inline>
-        </w:drawing>
+        <w:rPr>
+          <w:i w:val="0"/>
+        </w:rPr>
+        <w:t>La implementación toma 26 semanas. Cada fase entrega funcionalidades que se pueden probar antes de pasar a la siguiente.</w:t>
       </w:r>
     </w:p>
+    <w:tbl>
+      <w:tblPr>
+        <w:tblStyle w:val="TableGrid"/>
+        <w:tblW w:type="auto" w:w="0"/>
+        <w:jc w:val="center"/>
+        <w:tblLayout w:type="fixed"/>
+        <w:tblLook w:firstColumn="1" w:firstRow="1" w:lastColumn="0" w:lastRow="0" w:noHBand="0" w:noVBand="1" w:val="04A0"/>
+      </w:tblPr>
+      <w:tblGrid>
+        <w:gridCol w:w="2304"/>
+        <w:gridCol w:w="540"/>
+        <w:gridCol w:w="540"/>
+        <w:gridCol w:w="540"/>
+        <w:gridCol w:w="540"/>
+        <w:gridCol w:w="540"/>
+        <w:gridCol w:w="540"/>
+        <w:gridCol w:w="540"/>
+        <w:gridCol w:w="540"/>
+        <w:gridCol w:w="540"/>
+        <w:gridCol w:w="540"/>
+        <w:gridCol w:w="540"/>
+        <w:gridCol w:w="540"/>
+        <w:gridCol w:w="540"/>
+      </w:tblGrid>
+      <w:tr>
+        <w:tc>
+          <w:tcPr>
+            <w:tcW w:type="dxa" w:w="2304"/>
+            <w:shd w:val="clear" w:color="auto" w:fill="0B3C5D"/>
+          </w:tcPr>
+          <w:p>
+            <w:pPr>
+              <w:jc w:val="center"/>
+            </w:pPr>
+            <w:r/>
+            <w:r>
+              <w:rPr>
+                <w:b/>
+                <w:color w:val="FFFFFF"/>
+                <w:sz w:val="18"/>
+              </w:rPr>
+              <w:t>Fase / semanas</w:t>
+            </w:r>
+          </w:p>
+        </w:tc>
+        <w:tc>
+          <w:tcPr>
+            <w:tcW w:type="dxa" w:w="540"/>
+            <w:shd w:val="clear" w:color="auto" w:fill="0B3C5D"/>
+          </w:tcPr>
+          <w:p>
+            <w:pPr>
+              <w:jc w:val="center"/>
+            </w:pPr>
+            <w:r/>
+            <w:r>
+              <w:rPr>
+                <w:b/>
+                <w:color w:val="FFFFFF"/>
+                <w:sz w:val="16"/>
+              </w:rPr>
+              <w:t>1-2</w:t>
+            </w:r>
+          </w:p>
+        </w:tc>
+        <w:tc>
+          <w:tcPr>
+            <w:tcW w:type="dxa" w:w="540"/>
+            <w:shd w:val="clear" w:color="auto" w:fill="0B3C5D"/>
+          </w:tcPr>
+          <w:p>
+            <w:pPr>
+              <w:jc w:val="center"/>
+            </w:pPr>
+            <w:r/>
+            <w:r>
+              <w:rPr>
+                <w:b/>
+                <w:color w:val="FFFFFF"/>
+                <w:sz w:val="16"/>
+              </w:rPr>
+              <w:t>3-4</w:t>
+            </w:r>
+          </w:p>
+        </w:tc>
+        <w:tc>
+          <w:tcPr>
+            <w:tcW w:type="dxa" w:w="540"/>
+            <w:shd w:val="clear" w:color="auto" w:fill="0B3C5D"/>
+          </w:tcPr>
+          <w:p>
+            <w:pPr>
+              <w:jc w:val="center"/>
+            </w:pPr>
+            <w:r/>
+            <w:r>
+              <w:rPr>
+                <w:b/>
+                <w:color w:val="FFFFFF"/>
+                <w:sz w:val="16"/>
+              </w:rPr>
+              <w:t>5-6</w:t>
+            </w:r>
+          </w:p>
+        </w:tc>
+        <w:tc>
+          <w:tcPr>
+            <w:tcW w:type="dxa" w:w="540"/>
+            <w:shd w:val="clear" w:color="auto" w:fill="0B3C5D"/>
+          </w:tcPr>
+          <w:p>
+            <w:pPr>
+              <w:jc w:val="center"/>
+            </w:pPr>
+            <w:r/>
+            <w:r>
+              <w:rPr>
+                <w:b/>
+                <w:color w:val="FFFFFF"/>
+                <w:sz w:val="16"/>
+              </w:rPr>
+              <w:t>7-8</w:t>
+            </w:r>
+          </w:p>
+        </w:tc>
+        <w:tc>
+          <w:tcPr>
+            <w:tcW w:type="dxa" w:w="540"/>
+            <w:shd w:val="clear" w:color="auto" w:fill="0B3C5D"/>
+          </w:tcPr>
+          <w:p>
+            <w:pPr>
+              <w:jc w:val="center"/>
+            </w:pPr>
+            <w:r/>
+            <w:r>
+              <w:rPr>
+                <w:b/>
+                <w:color w:val="FFFFFF"/>
+                <w:sz w:val="16"/>
+              </w:rPr>
+              <w:t>9-10</w:t>
+            </w:r>
+          </w:p>
+        </w:tc>
+        <w:tc>
+          <w:tcPr>
+            <w:tcW w:type="dxa" w:w="540"/>
+            <w:shd w:val="clear" w:color="auto" w:fill="0B3C5D"/>
+          </w:tcPr>
+          <w:p>
+            <w:pPr>
+              <w:jc w:val="center"/>
+            </w:pPr>
+            <w:r/>
+            <w:r>
+              <w:rPr>
+                <w:b/>
+                <w:color w:val="FFFFFF"/>
+                <w:sz w:val="16"/>
+              </w:rPr>
+              <w:t>11-12</w:t>
+            </w:r>
+          </w:p>
+        </w:tc>
+        <w:tc>
+          <w:tcPr>
+            <w:tcW w:type="dxa" w:w="540"/>
+            <w:shd w:val="clear" w:color="auto" w:fill="0B3C5D"/>
+          </w:tcPr>
+          <w:p>
+            <w:pPr>
+              <w:jc w:val="center"/>
+            </w:pPr>
+            <w:r/>
+            <w:r>
+              <w:rPr>
+                <w:b/>
+                <w:color w:val="FFFFFF"/>
+                <w:sz w:val="16"/>
+              </w:rPr>
+              <w:t>13-14</w:t>
+            </w:r>
+          </w:p>
+        </w:tc>
+        <w:tc>
+          <w:tcPr>
+            <w:tcW w:type="dxa" w:w="540"/>
+            <w:shd w:val="clear" w:color="auto" w:fill="0B3C5D"/>
+          </w:tcPr>
+          <w:p>
+            <w:pPr>
+              <w:jc w:val="center"/>
+            </w:pPr>
+            <w:r/>
+            <w:r>
+              <w:rPr>
+                <w:b/>
+                <w:color w:val="FFFFFF"/>
+                <w:sz w:val="16"/>
+              </w:rPr>
+              <w:t>15-16</w:t>
+            </w:r>
+          </w:p>
+        </w:tc>
+        <w:tc>
+          <w:tcPr>
+            <w:tcW w:type="dxa" w:w="540"/>
+            <w:shd w:val="clear" w:color="auto" w:fill="0B3C5D"/>
+          </w:tcPr>
+          <w:p>
+            <w:pPr>
+              <w:jc w:val="center"/>
+            </w:pPr>
+            <w:r/>
+            <w:r>
+              <w:rPr>
+                <w:b/>
+                <w:color w:val="FFFFFF"/>
+                <w:sz w:val="16"/>
+              </w:rPr>
+              <w:t>17-18</w:t>
+            </w:r>
+          </w:p>
+        </w:tc>
+        <w:tc>
+          <w:tcPr>
+            <w:tcW w:type="dxa" w:w="540"/>
+            <w:shd w:val="clear" w:color="auto" w:fill="0B3C5D"/>
+          </w:tcPr>
+          <w:p>
+            <w:pPr>
+              <w:jc w:val="center"/>
+            </w:pPr>
+            <w:r/>
+            <w:r>
+              <w:rPr>
+                <w:b/>
+                <w:color w:val="FFFFFF"/>
+                <w:sz w:val="16"/>
+              </w:rPr>
+              <w:t>19-20</w:t>
+            </w:r>
+          </w:p>
+        </w:tc>
+        <w:tc>
+          <w:tcPr>
+            <w:tcW w:type="dxa" w:w="540"/>
+            <w:shd w:val="clear" w:color="auto" w:fill="0B3C5D"/>
+          </w:tcPr>
+          <w:p>
+            <w:pPr>
+              <w:jc w:val="center"/>
+            </w:pPr>
+            <w:r/>
+            <w:r>
+              <w:rPr>
+                <w:b/>
+                <w:color w:val="FFFFFF"/>
+                <w:sz w:val="16"/>
+              </w:rPr>
+              <w:t>21-22</w:t>
+            </w:r>
+          </w:p>
+        </w:tc>
+        <w:tc>
+          <w:tcPr>
+            <w:tcW w:type="dxa" w:w="540"/>
+            <w:shd w:val="clear" w:color="auto" w:fill="0B3C5D"/>
+          </w:tcPr>
+          <w:p>
+            <w:pPr>
+              <w:jc w:val="center"/>
+            </w:pPr>
+            <w:r/>
+            <w:r>
+              <w:rPr>
+                <w:b/>
+                <w:color w:val="FFFFFF"/>
+                <w:sz w:val="16"/>
+              </w:rPr>
+              <w:t>23-24</w:t>
+            </w:r>
+          </w:p>
+        </w:tc>
+        <w:tc>
+          <w:tcPr>
+            <w:tcW w:type="dxa" w:w="540"/>
+            <w:shd w:val="clear" w:color="auto" w:fill="0B3C5D"/>
+          </w:tcPr>
+          <w:p>
+            <w:pPr>
+              <w:jc w:val="center"/>
+            </w:pPr>
+            <w:r/>
+            <w:r>
+              <w:rPr>
+                <w:b/>
+                <w:color w:val="FFFFFF"/>
+                <w:sz w:val="16"/>
+              </w:rPr>
+              <w:t>25-26</w:t>
+            </w:r>
+          </w:p>
+        </w:tc>
+      </w:tr>
+      <w:tr>
+        <w:trPr>
+          <w:trHeight w:val="461"/>
+        </w:trPr>
+        <w:tc>
+          <w:tcPr>
+            <w:tcW w:type="dxa" w:w="2304"/>
+          </w:tcPr>
+          <w:p>
+            <w:r/>
+            <w:r>
+              <w:rPr>
+                <w:b/>
+                <w:sz w:val="18"/>
+              </w:rPr>
+              <w:t>0. Preparación</w:t>
+            </w:r>
+          </w:p>
+        </w:tc>
+        <w:tc>
+          <w:tcPr>
+            <w:tcW w:type="dxa" w:w="540"/>
+            <w:shd w:val="clear" w:color="auto" w:fill="0B3C5D"/>
+          </w:tcPr>
+          <w:p>
+            <w:r/>
+          </w:p>
+        </w:tc>
+        <w:tc>
+          <w:tcPr>
+            <w:tcW w:type="dxa" w:w="540"/>
+          </w:tcPr>
+          <w:p>
+            <w:r/>
+          </w:p>
+        </w:tc>
+        <w:tc>
+          <w:tcPr>
+            <w:tcW w:type="dxa" w:w="540"/>
+          </w:tcPr>
+          <w:p>
+            <w:r/>
+          </w:p>
+        </w:tc>
+        <w:tc>
+          <w:tcPr>
+            <w:tcW w:type="dxa" w:w="540"/>
+          </w:tcPr>
+          <w:p>
+            <w:r/>
+          </w:p>
+        </w:tc>
+        <w:tc>
+          <w:tcPr>
+            <w:tcW w:type="dxa" w:w="540"/>
+          </w:tcPr>
+          <w:p>
+            <w:r/>
+          </w:p>
+        </w:tc>
+        <w:tc>
+          <w:tcPr>
+            <w:tcW w:type="dxa" w:w="540"/>
+          </w:tcPr>
+          <w:p>
+            <w:r/>
+          </w:p>
+        </w:tc>
+        <w:tc>
+          <w:tcPr>
+            <w:tcW w:type="dxa" w:w="540"/>
+          </w:tcPr>
+          <w:p>
+            <w:r/>
+          </w:p>
+        </w:tc>
+        <w:tc>
+          <w:tcPr>
+            <w:tcW w:type="dxa" w:w="540"/>
+          </w:tcPr>
+          <w:p>
+            <w:r/>
+          </w:p>
+        </w:tc>
+        <w:tc>
+          <w:tcPr>
+            <w:tcW w:type="dxa" w:w="540"/>
+          </w:tcPr>
+          <w:p>
+            <w:r/>
+          </w:p>
+        </w:tc>
+        <w:tc>
+          <w:tcPr>
+            <w:tcW w:type="dxa" w:w="540"/>
+          </w:tcPr>
+          <w:p>
+            <w:r/>
+          </w:p>
+        </w:tc>
+        <w:tc>
+          <w:tcPr>
+            <w:tcW w:type="dxa" w:w="540"/>
+          </w:tcPr>
+          <w:p>
+            <w:r/>
+          </w:p>
+        </w:tc>
+        <w:tc>
+          <w:tcPr>
+            <w:tcW w:type="dxa" w:w="540"/>
+          </w:tcPr>
+          <w:p>
+            <w:r/>
+          </w:p>
+        </w:tc>
+        <w:tc>
+          <w:tcPr>
+            <w:tcW w:type="dxa" w:w="540"/>
+          </w:tcPr>
+          <w:p>
+            <w:r/>
+          </w:p>
+        </w:tc>
+      </w:tr>
+      <w:tr>
+        <w:trPr>
+          <w:trHeight w:val="461"/>
+        </w:trPr>
+        <w:tc>
+          <w:tcPr>
+            <w:tcW w:type="dxa" w:w="2304"/>
+          </w:tcPr>
+          <w:p>
+            <w:r/>
+            <w:r>
+              <w:rPr>
+                <w:b/>
+                <w:sz w:val="18"/>
+              </w:rPr>
+              <w:t>1. Plataforma base</w:t>
+            </w:r>
+          </w:p>
+        </w:tc>
+        <w:tc>
+          <w:tcPr>
+            <w:tcW w:type="dxa" w:w="540"/>
+          </w:tcPr>
+          <w:p>
+            <w:r/>
+          </w:p>
+        </w:tc>
+        <w:tc>
+          <w:tcPr>
+            <w:tcW w:type="dxa" w:w="540"/>
+            <w:shd w:val="clear" w:color="auto" w:fill="1168BD"/>
+          </w:tcPr>
+          <w:p>
+            <w:r/>
+          </w:p>
+        </w:tc>
+        <w:tc>
+          <w:tcPr>
+            <w:tcW w:type="dxa" w:w="540"/>
+            <w:shd w:val="clear" w:color="auto" w:fill="1168BD"/>
+          </w:tcPr>
+          <w:p>
+            <w:r/>
+          </w:p>
+        </w:tc>
+        <w:tc>
+          <w:tcPr>
+            <w:tcW w:type="dxa" w:w="540"/>
+            <w:shd w:val="clear" w:color="auto" w:fill="1168BD"/>
+          </w:tcPr>
+          <w:p>
+            <w:r/>
+          </w:p>
+        </w:tc>
+        <w:tc>
+          <w:tcPr>
+            <w:tcW w:type="dxa" w:w="540"/>
+          </w:tcPr>
+          <w:p>
+            <w:r/>
+          </w:p>
+        </w:tc>
+        <w:tc>
+          <w:tcPr>
+            <w:tcW w:type="dxa" w:w="540"/>
+          </w:tcPr>
+          <w:p>
+            <w:r/>
+          </w:p>
+        </w:tc>
+        <w:tc>
+          <w:tcPr>
+            <w:tcW w:type="dxa" w:w="540"/>
+          </w:tcPr>
+          <w:p>
+            <w:r/>
+          </w:p>
+        </w:tc>
+        <w:tc>
+          <w:tcPr>
+            <w:tcW w:type="dxa" w:w="540"/>
+          </w:tcPr>
+          <w:p>
+            <w:r/>
+          </w:p>
+        </w:tc>
+        <w:tc>
+          <w:tcPr>
+            <w:tcW w:type="dxa" w:w="540"/>
+          </w:tcPr>
+          <w:p>
+            <w:r/>
+          </w:p>
+        </w:tc>
+        <w:tc>
+          <w:tcPr>
+            <w:tcW w:type="dxa" w:w="540"/>
+          </w:tcPr>
+          <w:p>
+            <w:r/>
+          </w:p>
+        </w:tc>
+        <w:tc>
+          <w:tcPr>
+            <w:tcW w:type="dxa" w:w="540"/>
+          </w:tcPr>
+          <w:p>
+            <w:r/>
+          </w:p>
+        </w:tc>
+        <w:tc>
+          <w:tcPr>
+            <w:tcW w:type="dxa" w:w="540"/>
+          </w:tcPr>
+          <w:p>
+            <w:r/>
+          </w:p>
+        </w:tc>
+        <w:tc>
+          <w:tcPr>
+            <w:tcW w:type="dxa" w:w="540"/>
+          </w:tcPr>
+          <w:p>
+            <w:r/>
+          </w:p>
+        </w:tc>
+      </w:tr>
+      <w:tr>
+        <w:trPr>
+          <w:trHeight w:val="461"/>
+        </w:trPr>
+        <w:tc>
+          <w:tcPr>
+            <w:tcW w:type="dxa" w:w="2304"/>
+          </w:tcPr>
+          <w:p>
+            <w:r/>
+            <w:r>
+              <w:rPr>
+                <w:b/>
+                <w:sz w:val="18"/>
+              </w:rPr>
+              <w:t>2. HU01 y HU03</w:t>
+            </w:r>
+          </w:p>
+        </w:tc>
+        <w:tc>
+          <w:tcPr>
+            <w:tcW w:type="dxa" w:w="540"/>
+          </w:tcPr>
+          <w:p>
+            <w:r/>
+          </w:p>
+        </w:tc>
+        <w:tc>
+          <w:tcPr>
+            <w:tcW w:type="dxa" w:w="540"/>
+          </w:tcPr>
+          <w:p>
+            <w:r/>
+          </w:p>
+        </w:tc>
+        <w:tc>
+          <w:tcPr>
+            <w:tcW w:type="dxa" w:w="540"/>
+          </w:tcPr>
+          <w:p>
+            <w:r/>
+          </w:p>
+        </w:tc>
+        <w:tc>
+          <w:tcPr>
+            <w:tcW w:type="dxa" w:w="540"/>
+          </w:tcPr>
+          <w:p>
+            <w:r/>
+          </w:p>
+        </w:tc>
+        <w:tc>
+          <w:tcPr>
+            <w:tcW w:type="dxa" w:w="540"/>
+            <w:shd w:val="clear" w:color="auto" w:fill="0E9F8E"/>
+          </w:tcPr>
+          <w:p>
+            <w:r/>
+          </w:p>
+        </w:tc>
+        <w:tc>
+          <w:tcPr>
+            <w:tcW w:type="dxa" w:w="540"/>
+            <w:shd w:val="clear" w:color="auto" w:fill="0E9F8E"/>
+          </w:tcPr>
+          <w:p>
+            <w:r/>
+          </w:p>
+        </w:tc>
+        <w:tc>
+          <w:tcPr>
+            <w:tcW w:type="dxa" w:w="540"/>
+            <w:shd w:val="clear" w:color="auto" w:fill="0E9F8E"/>
+          </w:tcPr>
+          <w:p>
+            <w:r/>
+          </w:p>
+        </w:tc>
+        <w:tc>
+          <w:tcPr>
+            <w:tcW w:type="dxa" w:w="540"/>
+          </w:tcPr>
+          <w:p>
+            <w:r/>
+          </w:p>
+        </w:tc>
+        <w:tc>
+          <w:tcPr>
+            <w:tcW w:type="dxa" w:w="540"/>
+          </w:tcPr>
+          <w:p>
+            <w:r/>
+          </w:p>
+        </w:tc>
+        <w:tc>
+          <w:tcPr>
+            <w:tcW w:type="dxa" w:w="540"/>
+          </w:tcPr>
+          <w:p>
+            <w:r/>
+          </w:p>
+        </w:tc>
+        <w:tc>
+          <w:tcPr>
+            <w:tcW w:type="dxa" w:w="540"/>
+          </w:tcPr>
+          <w:p>
+            <w:r/>
+          </w:p>
+        </w:tc>
+        <w:tc>
+          <w:tcPr>
+            <w:tcW w:type="dxa" w:w="540"/>
+          </w:tcPr>
+          <w:p>
+            <w:r/>
+          </w:p>
+        </w:tc>
+        <w:tc>
+          <w:tcPr>
+            <w:tcW w:type="dxa" w:w="540"/>
+          </w:tcPr>
+          <w:p>
+            <w:r/>
+          </w:p>
+        </w:tc>
+      </w:tr>
+      <w:tr>
+        <w:trPr>
+          <w:trHeight w:val="461"/>
+        </w:trPr>
+        <w:tc>
+          <w:tcPr>
+            <w:tcW w:type="dxa" w:w="2304"/>
+          </w:tcPr>
+          <w:p>
+            <w:r/>
+            <w:r>
+              <w:rPr>
+                <w:b/>
+                <w:sz w:val="18"/>
+              </w:rPr>
+              <w:t>3. HU02 y HU04</w:t>
+            </w:r>
+          </w:p>
+        </w:tc>
+        <w:tc>
+          <w:tcPr>
+            <w:tcW w:type="dxa" w:w="540"/>
+          </w:tcPr>
+          <w:p>
+            <w:r/>
+          </w:p>
+        </w:tc>
+        <w:tc>
+          <w:tcPr>
+            <w:tcW w:type="dxa" w:w="540"/>
+          </w:tcPr>
+          <w:p>
+            <w:r/>
+          </w:p>
+        </w:tc>
+        <w:tc>
+          <w:tcPr>
+            <w:tcW w:type="dxa" w:w="540"/>
+          </w:tcPr>
+          <w:p>
+            <w:r/>
+          </w:p>
+        </w:tc>
+        <w:tc>
+          <w:tcPr>
+            <w:tcW w:type="dxa" w:w="540"/>
+          </w:tcPr>
+          <w:p>
+            <w:r/>
+          </w:p>
+        </w:tc>
+        <w:tc>
+          <w:tcPr>
+            <w:tcW w:type="dxa" w:w="540"/>
+          </w:tcPr>
+          <w:p>
+            <w:r/>
+          </w:p>
+        </w:tc>
+        <w:tc>
+          <w:tcPr>
+            <w:tcW w:type="dxa" w:w="540"/>
+          </w:tcPr>
+          <w:p>
+            <w:r/>
+          </w:p>
+        </w:tc>
+        <w:tc>
+          <w:tcPr>
+            <w:tcW w:type="dxa" w:w="540"/>
+          </w:tcPr>
+          <w:p>
+            <w:r/>
+          </w:p>
+        </w:tc>
+        <w:tc>
+          <w:tcPr>
+            <w:tcW w:type="dxa" w:w="540"/>
+            <w:shd w:val="clear" w:color="auto" w:fill="D86C1F"/>
+          </w:tcPr>
+          <w:p>
+            <w:r/>
+          </w:p>
+        </w:tc>
+        <w:tc>
+          <w:tcPr>
+            <w:tcW w:type="dxa" w:w="540"/>
+            <w:shd w:val="clear" w:color="auto" w:fill="D86C1F"/>
+          </w:tcPr>
+          <w:p>
+            <w:r/>
+          </w:p>
+        </w:tc>
+        <w:tc>
+          <w:tcPr>
+            <w:tcW w:type="dxa" w:w="540"/>
+            <w:shd w:val="clear" w:color="auto" w:fill="D86C1F"/>
+          </w:tcPr>
+          <w:p>
+            <w:r/>
+          </w:p>
+        </w:tc>
+        <w:tc>
+          <w:tcPr>
+            <w:tcW w:type="dxa" w:w="540"/>
+          </w:tcPr>
+          <w:p>
+            <w:r/>
+          </w:p>
+        </w:tc>
+        <w:tc>
+          <w:tcPr>
+            <w:tcW w:type="dxa" w:w="540"/>
+          </w:tcPr>
+          <w:p>
+            <w:r/>
+          </w:p>
+        </w:tc>
+        <w:tc>
+          <w:tcPr>
+            <w:tcW w:type="dxa" w:w="540"/>
+          </w:tcPr>
+          <w:p>
+            <w:r/>
+          </w:p>
+        </w:tc>
+      </w:tr>
+      <w:tr>
+        <w:trPr>
+          <w:trHeight w:val="461"/>
+        </w:trPr>
+        <w:tc>
+          <w:tcPr>
+            <w:tcW w:type="dxa" w:w="2304"/>
+          </w:tcPr>
+          <w:p>
+            <w:r/>
+            <w:r>
+              <w:rPr>
+                <w:b/>
+                <w:sz w:val="18"/>
+              </w:rPr>
+              <w:t>4. Pruebas y piloto</w:t>
+            </w:r>
+          </w:p>
+        </w:tc>
+        <w:tc>
+          <w:tcPr>
+            <w:tcW w:type="dxa" w:w="540"/>
+          </w:tcPr>
+          <w:p>
+            <w:r/>
+          </w:p>
+        </w:tc>
+        <w:tc>
+          <w:tcPr>
+            <w:tcW w:type="dxa" w:w="540"/>
+          </w:tcPr>
+          <w:p>
+            <w:r/>
+          </w:p>
+        </w:tc>
+        <w:tc>
+          <w:tcPr>
+            <w:tcW w:type="dxa" w:w="540"/>
+          </w:tcPr>
+          <w:p>
+            <w:r/>
+          </w:p>
+        </w:tc>
+        <w:tc>
+          <w:tcPr>
+            <w:tcW w:type="dxa" w:w="540"/>
+          </w:tcPr>
+          <w:p>
+            <w:r/>
+          </w:p>
+        </w:tc>
+        <w:tc>
+          <w:tcPr>
+            <w:tcW w:type="dxa" w:w="540"/>
+          </w:tcPr>
+          <w:p>
+            <w:r/>
+          </w:p>
+        </w:tc>
+        <w:tc>
+          <w:tcPr>
+            <w:tcW w:type="dxa" w:w="540"/>
+          </w:tcPr>
+          <w:p>
+            <w:r/>
+          </w:p>
+        </w:tc>
+        <w:tc>
+          <w:tcPr>
+            <w:tcW w:type="dxa" w:w="540"/>
+          </w:tcPr>
+          <w:p>
+            <w:r/>
+          </w:p>
+        </w:tc>
+        <w:tc>
+          <w:tcPr>
+            <w:tcW w:type="dxa" w:w="540"/>
+          </w:tcPr>
+          <w:p>
+            <w:r/>
+          </w:p>
+        </w:tc>
+        <w:tc>
+          <w:tcPr>
+            <w:tcW w:type="dxa" w:w="540"/>
+          </w:tcPr>
+          <w:p>
+            <w:r/>
+          </w:p>
+        </w:tc>
+        <w:tc>
+          <w:tcPr>
+            <w:tcW w:type="dxa" w:w="540"/>
+          </w:tcPr>
+          <w:p>
+            <w:r/>
+          </w:p>
+        </w:tc>
+        <w:tc>
+          <w:tcPr>
+            <w:tcW w:type="dxa" w:w="540"/>
+            <w:shd w:val="clear" w:color="auto" w:fill="6B4FBB"/>
+          </w:tcPr>
+          <w:p>
+            <w:r/>
+          </w:p>
+        </w:tc>
+        <w:tc>
+          <w:tcPr>
+            <w:tcW w:type="dxa" w:w="540"/>
+            <w:shd w:val="clear" w:color="auto" w:fill="6B4FBB"/>
+          </w:tcPr>
+          <w:p>
+            <w:r/>
+          </w:p>
+        </w:tc>
+        <w:tc>
+          <w:tcPr>
+            <w:tcW w:type="dxa" w:w="540"/>
+          </w:tcPr>
+          <w:p>
+            <w:r/>
+          </w:p>
+        </w:tc>
+      </w:tr>
+      <w:tr>
+        <w:trPr>
+          <w:trHeight w:val="461"/>
+        </w:trPr>
+        <w:tc>
+          <w:tcPr>
+            <w:tcW w:type="dxa" w:w="2304"/>
+          </w:tcPr>
+          <w:p>
+            <w:r/>
+            <w:r>
+              <w:rPr>
+                <w:b/>
+                <w:sz w:val="18"/>
+              </w:rPr>
+              <w:t>5. Salida</w:t>
+            </w:r>
+          </w:p>
+        </w:tc>
+        <w:tc>
+          <w:tcPr>
+            <w:tcW w:type="dxa" w:w="540"/>
+          </w:tcPr>
+          <w:p>
+            <w:r/>
+          </w:p>
+        </w:tc>
+        <w:tc>
+          <w:tcPr>
+            <w:tcW w:type="dxa" w:w="540"/>
+          </w:tcPr>
+          <w:p>
+            <w:r/>
+          </w:p>
+        </w:tc>
+        <w:tc>
+          <w:tcPr>
+            <w:tcW w:type="dxa" w:w="540"/>
+          </w:tcPr>
+          <w:p>
+            <w:r/>
+          </w:p>
+        </w:tc>
+        <w:tc>
+          <w:tcPr>
+            <w:tcW w:type="dxa" w:w="540"/>
+          </w:tcPr>
+          <w:p>
+            <w:r/>
+          </w:p>
+        </w:tc>
+        <w:tc>
+          <w:tcPr>
+            <w:tcW w:type="dxa" w:w="540"/>
+          </w:tcPr>
+          <w:p>
+            <w:r/>
+          </w:p>
+        </w:tc>
+        <w:tc>
+          <w:tcPr>
+            <w:tcW w:type="dxa" w:w="540"/>
+          </w:tcPr>
+          <w:p>
+            <w:r/>
+          </w:p>
+        </w:tc>
+        <w:tc>
+          <w:tcPr>
+            <w:tcW w:type="dxa" w:w="540"/>
+          </w:tcPr>
+          <w:p>
+            <w:r/>
+          </w:p>
+        </w:tc>
+        <w:tc>
+          <w:tcPr>
+            <w:tcW w:type="dxa" w:w="540"/>
+          </w:tcPr>
+          <w:p>
+            <w:r/>
+          </w:p>
+        </w:tc>
+        <w:tc>
+          <w:tcPr>
+            <w:tcW w:type="dxa" w:w="540"/>
+          </w:tcPr>
+          <w:p>
+            <w:r/>
+          </w:p>
+        </w:tc>
+        <w:tc>
+          <w:tcPr>
+            <w:tcW w:type="dxa" w:w="540"/>
+          </w:tcPr>
+          <w:p>
+            <w:r/>
+          </w:p>
+        </w:tc>
+        <w:tc>
+          <w:tcPr>
+            <w:tcW w:type="dxa" w:w="540"/>
+          </w:tcPr>
+          <w:p>
+            <w:r/>
+          </w:p>
+        </w:tc>
+        <w:tc>
+          <w:tcPr>
+            <w:tcW w:type="dxa" w:w="540"/>
+          </w:tcPr>
+          <w:p>
+            <w:r/>
+          </w:p>
+        </w:tc>
+        <w:tc>
+          <w:tcPr>
+            <w:tcW w:type="dxa" w:w="540"/>
+            <w:shd w:val="clear" w:color="auto" w:fill="107C10"/>
+          </w:tcPr>
+          <w:p>
+            <w:r/>
+          </w:p>
+        </w:tc>
+      </w:tr>
+    </w:tbl>
+    <w:p/>
     <w:p>
       <w:pPr>
         <w:jc w:val="center"/>
@@ -8458,7 +9830,7 @@
           <w:i/>
           <w:sz w:val="18"/>
         </w:rPr>
-        <w:t>Figura 10. Cronograma tentativo de implementación.</w:t>
+        <w:t>Figura 10. Cronograma tentativo de implementación (semanas).</w:t>
       </w:r>
     </w:p>
     <w:tbl>
@@ -8591,7 +9963,7 @@
               <w:rPr>
                 <w:sz w:val="18"/>
               </w:rPr>
-              <w:t>Landing zone, redes, infraestructura como código, CI/CD.</w:t>
+              <w:t>Landing zone, redes, infraestructura como código y CI/CD.</w:t>
             </w:r>
           </w:p>
         </w:tc>
@@ -8650,7 +10022,7 @@
               <w:rPr>
                 <w:sz w:val="18"/>
               </w:rPr>
-              <w:t>AKS, API Management, Front Door, federación OIDC, observabilidad, servicio de casos.</w:t>
+              <w:t>AKS, API Management, Front Door, federación OIDC y monitoreo.</w:t>
             </w:r>
           </w:p>
         </w:tc>
@@ -8689,7 +10061,7 @@
               <w:rPr>
                 <w:sz w:val="18"/>
               </w:rPr>
-              <w:t>9-13</w:t>
+              <w:t>9-14</w:t>
             </w:r>
           </w:p>
         </w:tc>
@@ -8747,7 +10119,7 @@
               <w:rPr>
                 <w:sz w:val="18"/>
               </w:rPr>
-              <w:t>13-19</w:t>
+              <w:t>15-20</w:t>
             </w:r>
           </w:p>
         </w:tc>
@@ -8765,7 +10137,7 @@
               <w:rPr>
                 <w:sz w:val="18"/>
               </w:rPr>
-              <w:t>Asistencia al diagnóstico validada por médicos, remisión y notificación.</w:t>
+              <w:t>Asistencia al diagnóstico validada por médicos, remisión y avisos.</w:t>
             </w:r>
           </w:p>
         </w:tc>
@@ -8787,7 +10159,7 @@
               <w:rPr>
                 <w:sz w:val="18"/>
               </w:rPr>
-              <w:t>4. Calidad</w:t>
+              <w:t>4. Pruebas y piloto</w:t>
             </w:r>
           </w:p>
         </w:tc>
@@ -8804,7 +10176,7 @@
               <w:rPr>
                 <w:sz w:val="18"/>
               </w:rPr>
-              <w:t>19-23</w:t>
+              <w:t>21-24</w:t>
             </w:r>
           </w:p>
         </w:tc>
@@ -8821,7 +10193,7 @@
               <w:rPr>
                 <w:sz w:val="18"/>
               </w:rPr>
-              <w:t>Pruebas de carga y seguridad, simulacro de recuperación, piloto con 25 enfermeras.</w:t>
+              <w:t>Pruebas de carga y seguridad, simulacro de caída, piloto con 25 enfermeras.</w:t>
             </w:r>
           </w:p>
         </w:tc>
@@ -8862,7 +10234,7 @@
               <w:rPr>
                 <w:sz w:val="18"/>
               </w:rPr>
-              <w:t>24-26</w:t>
+              <w:t>25-26</w:t>
             </w:r>
           </w:p>
         </w:tc>

</xml_diff>